<commit_message>
Actualizacion de documentacion para anexar la evidencia del patron singleton
</commit_message>
<xml_diff>
--- a/Sistema de Gestion de Cadenas de Suministro.docx
+++ b/Sistema de Gestion de Cadenas de Suministro.docx
@@ -259,7 +259,7 @@
     </w:p>
     <w:p>
       <w:pPr>
-        <w:pStyle w:val="TOCHeading"/>
+        <w:pStyle w:val="TtuloTDC1"/>
         <w:jc w:val="center"/>
         <w:rPr>
           <w:rFonts w:ascii="Calibri" w:hAnsi="Calibri" w:cs="Calibri"/>
@@ -302,7 +302,7 @@
       <w:r>
         <w:fldChar w:fldCharType="separate"/>
       </w:r>
-      <w:hyperlink w:anchor="_Toc237881516" w:history="1">
+      <w:hyperlink w:anchor="_Toc239179212" w:history="1">
         <w:r>
           <w:rPr>
             <w:rStyle w:val="Hipervnculo"/>
@@ -344,7 +344,7 @@
             <w:noProof/>
             <w:webHidden/>
           </w:rPr>
-          <w:instrText xml:space="preserve"> PAGEREF _Toc237881516 \h </w:instrText>
+          <w:instrText xml:space="preserve"> PAGEREF _Toc239179212 \h </w:instrText>
         </w:r>
         <w:r>
           <w:rPr>
@@ -388,7 +388,7 @@
           <w:lang w:eastAsia="es-CO"/>
         </w:rPr>
       </w:pPr>
-      <w:hyperlink w:anchor="_Toc237881517" w:history="1">
+      <w:hyperlink w:anchor="_Toc239179213" w:history="1">
         <w:r>
           <w:rPr>
             <w:rStyle w:val="Hipervnculo"/>
@@ -430,7 +430,7 @@
             <w:noProof/>
             <w:webHidden/>
           </w:rPr>
-          <w:instrText xml:space="preserve"> PAGEREF _Toc237881517 \h </w:instrText>
+          <w:instrText xml:space="preserve"> PAGEREF _Toc239179213 \h </w:instrText>
         </w:r>
         <w:r>
           <w:rPr>
@@ -450,7 +450,7 @@
             <w:noProof/>
             <w:webHidden/>
           </w:rPr>
-          <w:t>4</w:t>
+          <w:t>5</w:t>
         </w:r>
         <w:r>
           <w:rPr>
@@ -474,7 +474,7 @@
           <w:lang w:eastAsia="es-CO"/>
         </w:rPr>
       </w:pPr>
-      <w:hyperlink w:anchor="_Toc237881518" w:history="1">
+      <w:hyperlink w:anchor="_Toc239179214" w:history="1">
         <w:r>
           <w:rPr>
             <w:rStyle w:val="Hipervnculo"/>
@@ -516,7 +516,7 @@
             <w:noProof/>
             <w:webHidden/>
           </w:rPr>
-          <w:instrText xml:space="preserve"> PAGEREF _Toc237881518 \h </w:instrText>
+          <w:instrText xml:space="preserve"> PAGEREF _Toc239179214 \h </w:instrText>
         </w:r>
         <w:r>
           <w:rPr>
@@ -536,7 +536,7 @@
             <w:noProof/>
             <w:webHidden/>
           </w:rPr>
-          <w:t>4</w:t>
+          <w:t>5</w:t>
         </w:r>
         <w:r>
           <w:rPr>
@@ -560,7 +560,7 @@
           <w:lang w:eastAsia="es-CO"/>
         </w:rPr>
       </w:pPr>
-      <w:hyperlink w:anchor="_Toc237881519" w:history="1">
+      <w:hyperlink w:anchor="_Toc239179215" w:history="1">
         <w:r>
           <w:rPr>
             <w:rStyle w:val="Hipervnculo"/>
@@ -602,7 +602,7 @@
             <w:noProof/>
             <w:webHidden/>
           </w:rPr>
-          <w:instrText xml:space="preserve"> PAGEREF _Toc237881519 \h </w:instrText>
+          <w:instrText xml:space="preserve"> PAGEREF _Toc239179215 \h </w:instrText>
         </w:r>
         <w:r>
           <w:rPr>
@@ -622,7 +622,7 @@
             <w:noProof/>
             <w:webHidden/>
           </w:rPr>
-          <w:t>4</w:t>
+          <w:t>5</w:t>
         </w:r>
         <w:r>
           <w:rPr>
@@ -646,7 +646,7 @@
           <w:lang w:eastAsia="es-CO"/>
         </w:rPr>
       </w:pPr>
-      <w:hyperlink w:anchor="_Toc237881520" w:history="1">
+      <w:hyperlink w:anchor="_Toc239179216" w:history="1">
         <w:r>
           <w:rPr>
             <w:rStyle w:val="Hipervnculo"/>
@@ -688,7 +688,7 @@
             <w:noProof/>
             <w:webHidden/>
           </w:rPr>
-          <w:instrText xml:space="preserve"> PAGEREF _Toc237881520 \h </w:instrText>
+          <w:instrText xml:space="preserve"> PAGEREF _Toc239179216 \h </w:instrText>
         </w:r>
         <w:r>
           <w:rPr>
@@ -708,7 +708,7 @@
             <w:noProof/>
             <w:webHidden/>
           </w:rPr>
-          <w:t>4</w:t>
+          <w:t>5</w:t>
         </w:r>
         <w:r>
           <w:rPr>
@@ -732,7 +732,7 @@
           <w:lang w:eastAsia="es-CO"/>
         </w:rPr>
       </w:pPr>
-      <w:hyperlink w:anchor="_Toc237881521" w:history="1">
+      <w:hyperlink w:anchor="_Toc239179217" w:history="1">
         <w:r>
           <w:rPr>
             <w:rStyle w:val="Hipervnculo"/>
@@ -774,7 +774,7 @@
             <w:noProof/>
             <w:webHidden/>
           </w:rPr>
-          <w:instrText xml:space="preserve"> PAGEREF _Toc237881521 \h </w:instrText>
+          <w:instrText xml:space="preserve"> PAGEREF _Toc239179217 \h </w:instrText>
         </w:r>
         <w:r>
           <w:rPr>
@@ -794,7 +794,7 @@
             <w:noProof/>
             <w:webHidden/>
           </w:rPr>
-          <w:t>6</w:t>
+          <w:t>7</w:t>
         </w:r>
         <w:r>
           <w:rPr>
@@ -818,7 +818,7 @@
           <w:lang w:eastAsia="es-CO"/>
         </w:rPr>
       </w:pPr>
-      <w:hyperlink w:anchor="_Toc237881522" w:history="1">
+      <w:hyperlink w:anchor="_Toc239179218" w:history="1">
         <w:r>
           <w:rPr>
             <w:rStyle w:val="Hipervnculo"/>
@@ -860,7 +860,7 @@
             <w:noProof/>
             <w:webHidden/>
           </w:rPr>
-          <w:instrText xml:space="preserve"> PAGEREF _Toc237881522 \h </w:instrText>
+          <w:instrText xml:space="preserve"> PAGEREF _Toc239179218 \h </w:instrText>
         </w:r>
         <w:r>
           <w:rPr>
@@ -880,7 +880,7 @@
             <w:noProof/>
             <w:webHidden/>
           </w:rPr>
-          <w:t>8</w:t>
+          <w:t>9</w:t>
         </w:r>
         <w:r>
           <w:rPr>
@@ -904,7 +904,7 @@
           <w:lang w:eastAsia="es-CO"/>
         </w:rPr>
       </w:pPr>
-      <w:hyperlink w:anchor="_Toc237881523" w:history="1">
+      <w:hyperlink w:anchor="_Toc239179219" w:history="1">
         <w:r>
           <w:rPr>
             <w:rStyle w:val="Hipervnculo"/>
@@ -946,7 +946,7 @@
             <w:noProof/>
             <w:webHidden/>
           </w:rPr>
-          <w:instrText xml:space="preserve"> PAGEREF _Toc237881523 \h </w:instrText>
+          <w:instrText xml:space="preserve"> PAGEREF _Toc239179219 \h </w:instrText>
         </w:r>
         <w:r>
           <w:rPr>
@@ -966,7 +966,7 @@
             <w:noProof/>
             <w:webHidden/>
           </w:rPr>
-          <w:t>10</w:t>
+          <w:t>11</w:t>
         </w:r>
         <w:r>
           <w:rPr>
@@ -990,7 +990,7 @@
           <w:lang w:eastAsia="es-CO"/>
         </w:rPr>
       </w:pPr>
-      <w:hyperlink w:anchor="_Toc237881524" w:history="1">
+      <w:hyperlink w:anchor="_Toc239179220" w:history="1">
         <w:r>
           <w:rPr>
             <w:rStyle w:val="Hipervnculo"/>
@@ -1032,7 +1032,7 @@
             <w:noProof/>
             <w:webHidden/>
           </w:rPr>
-          <w:instrText xml:space="preserve"> PAGEREF _Toc237881524 \h </w:instrText>
+          <w:instrText xml:space="preserve"> PAGEREF _Toc239179220 \h </w:instrText>
         </w:r>
         <w:r>
           <w:rPr>
@@ -1052,7 +1052,7 @@
             <w:noProof/>
             <w:webHidden/>
           </w:rPr>
-          <w:t>10</w:t>
+          <w:t>11</w:t>
         </w:r>
         <w:r>
           <w:rPr>
@@ -1076,7 +1076,7 @@
           <w:lang w:eastAsia="es-CO"/>
         </w:rPr>
       </w:pPr>
-      <w:hyperlink w:anchor="_Toc237881525" w:history="1">
+      <w:hyperlink w:anchor="_Toc239179221" w:history="1">
         <w:r>
           <w:rPr>
             <w:rStyle w:val="Hipervnculo"/>
@@ -1118,7 +1118,7 @@
             <w:noProof/>
             <w:webHidden/>
           </w:rPr>
-          <w:instrText xml:space="preserve"> PAGEREF _Toc237881525 \h </w:instrText>
+          <w:instrText xml:space="preserve"> PAGEREF _Toc239179221 \h </w:instrText>
         </w:r>
         <w:r>
           <w:rPr>
@@ -1138,7 +1138,7 @@
             <w:noProof/>
             <w:webHidden/>
           </w:rPr>
-          <w:t>10</w:t>
+          <w:t>11</w:t>
         </w:r>
         <w:r>
           <w:rPr>
@@ -1162,7 +1162,7 @@
           <w:lang w:eastAsia="es-CO"/>
         </w:rPr>
       </w:pPr>
-      <w:hyperlink w:anchor="_Toc237881526" w:history="1">
+      <w:hyperlink w:anchor="_Toc239179222" w:history="1">
         <w:r>
           <w:rPr>
             <w:rStyle w:val="Hipervnculo"/>
@@ -1204,7 +1204,7 @@
             <w:noProof/>
             <w:webHidden/>
           </w:rPr>
-          <w:instrText xml:space="preserve"> PAGEREF _Toc237881526 \h </w:instrText>
+          <w:instrText xml:space="preserve"> PAGEREF _Toc239179222 \h </w:instrText>
         </w:r>
         <w:r>
           <w:rPr>
@@ -1224,7 +1224,7 @@
             <w:noProof/>
             <w:webHidden/>
           </w:rPr>
-          <w:t>11</w:t>
+          <w:t>12</w:t>
         </w:r>
         <w:r>
           <w:rPr>
@@ -1248,7 +1248,7 @@
           <w:lang w:eastAsia="es-CO"/>
         </w:rPr>
       </w:pPr>
-      <w:hyperlink w:anchor="_Toc237881527" w:history="1">
+      <w:hyperlink w:anchor="_Toc239179223" w:history="1">
         <w:r>
           <w:rPr>
             <w:rStyle w:val="Hipervnculo"/>
@@ -1290,7 +1290,7 @@
             <w:noProof/>
             <w:webHidden/>
           </w:rPr>
-          <w:instrText xml:space="preserve"> PAGEREF _Toc237881527 \h </w:instrText>
+          <w:instrText xml:space="preserve"> PAGEREF _Toc239179223 \h </w:instrText>
         </w:r>
         <w:r>
           <w:rPr>
@@ -1310,7 +1310,7 @@
             <w:noProof/>
             <w:webHidden/>
           </w:rPr>
-          <w:t>11</w:t>
+          <w:t>12</w:t>
         </w:r>
         <w:r>
           <w:rPr>
@@ -1334,7 +1334,7 @@
           <w:lang w:eastAsia="es-CO"/>
         </w:rPr>
       </w:pPr>
-      <w:hyperlink w:anchor="_Toc237881528" w:history="1">
+      <w:hyperlink w:anchor="_Toc239179224" w:history="1">
         <w:r>
           <w:rPr>
             <w:rStyle w:val="Hipervnculo"/>
@@ -1376,7 +1376,7 @@
             <w:noProof/>
             <w:webHidden/>
           </w:rPr>
-          <w:instrText xml:space="preserve"> PAGEREF _Toc237881528 \h </w:instrText>
+          <w:instrText xml:space="preserve"> PAGEREF _Toc239179224 \h </w:instrText>
         </w:r>
         <w:r>
           <w:rPr>
@@ -1396,7 +1396,7 @@
             <w:noProof/>
             <w:webHidden/>
           </w:rPr>
-          <w:t>11</w:t>
+          <w:t>12</w:t>
         </w:r>
         <w:r>
           <w:rPr>
@@ -1420,7 +1420,7 @@
           <w:lang w:eastAsia="es-CO"/>
         </w:rPr>
       </w:pPr>
-      <w:hyperlink w:anchor="_Toc237881529" w:history="1">
+      <w:hyperlink w:anchor="_Toc239179225" w:history="1">
         <w:r>
           <w:rPr>
             <w:rStyle w:val="Hipervnculo"/>
@@ -1462,7 +1462,7 @@
             <w:noProof/>
             <w:webHidden/>
           </w:rPr>
-          <w:instrText xml:space="preserve"> PAGEREF _Toc237881529 \h </w:instrText>
+          <w:instrText xml:space="preserve"> PAGEREF _Toc239179225 \h </w:instrText>
         </w:r>
         <w:r>
           <w:rPr>
@@ -1482,7 +1482,7 @@
             <w:noProof/>
             <w:webHidden/>
           </w:rPr>
-          <w:t>11</w:t>
+          <w:t>12</w:t>
         </w:r>
         <w:r>
           <w:rPr>
@@ -1506,7 +1506,7 @@
           <w:lang w:eastAsia="es-CO"/>
         </w:rPr>
       </w:pPr>
-      <w:hyperlink w:anchor="_Toc237881530" w:history="1">
+      <w:hyperlink w:anchor="_Toc239179226" w:history="1">
         <w:r>
           <w:rPr>
             <w:rStyle w:val="Hipervnculo"/>
@@ -1548,7 +1548,7 @@
             <w:noProof/>
             <w:webHidden/>
           </w:rPr>
-          <w:instrText xml:space="preserve"> PAGEREF _Toc237881530 \h </w:instrText>
+          <w:instrText xml:space="preserve"> PAGEREF _Toc239179226 \h </w:instrText>
         </w:r>
         <w:r>
           <w:rPr>
@@ -1568,7 +1568,7 @@
             <w:noProof/>
             <w:webHidden/>
           </w:rPr>
-          <w:t>11</w:t>
+          <w:t>12</w:t>
         </w:r>
         <w:r>
           <w:rPr>
@@ -1592,7 +1592,7 @@
           <w:lang w:eastAsia="es-CO"/>
         </w:rPr>
       </w:pPr>
-      <w:hyperlink w:anchor="_Toc237881531" w:history="1">
+      <w:hyperlink w:anchor="_Toc239179227" w:history="1">
         <w:r>
           <w:rPr>
             <w:rStyle w:val="Hipervnculo"/>
@@ -1634,7 +1634,7 @@
             <w:noProof/>
             <w:webHidden/>
           </w:rPr>
-          <w:instrText xml:space="preserve"> PAGEREF _Toc237881531 \h </w:instrText>
+          <w:instrText xml:space="preserve"> PAGEREF _Toc239179227 \h </w:instrText>
         </w:r>
         <w:r>
           <w:rPr>
@@ -1654,7 +1654,7 @@
             <w:noProof/>
             <w:webHidden/>
           </w:rPr>
-          <w:t>11</w:t>
+          <w:t>12</w:t>
         </w:r>
         <w:r>
           <w:rPr>
@@ -1678,7 +1678,7 @@
           <w:lang w:eastAsia="es-CO"/>
         </w:rPr>
       </w:pPr>
-      <w:hyperlink w:anchor="_Toc237881532" w:history="1">
+      <w:hyperlink w:anchor="_Toc239179228" w:history="1">
         <w:r>
           <w:rPr>
             <w:rStyle w:val="Hipervnculo"/>
@@ -1720,7 +1720,7 @@
             <w:noProof/>
             <w:webHidden/>
           </w:rPr>
-          <w:instrText xml:space="preserve"> PAGEREF _Toc237881532 \h </w:instrText>
+          <w:instrText xml:space="preserve"> PAGEREF _Toc239179228 \h </w:instrText>
         </w:r>
         <w:r>
           <w:rPr>
@@ -1740,7 +1740,7 @@
             <w:noProof/>
             <w:webHidden/>
           </w:rPr>
-          <w:t>11</w:t>
+          <w:t>12</w:t>
         </w:r>
         <w:r>
           <w:rPr>
@@ -1764,7 +1764,7 @@
           <w:lang w:eastAsia="es-CO"/>
         </w:rPr>
       </w:pPr>
-      <w:hyperlink w:anchor="_Toc237881533" w:history="1">
+      <w:hyperlink w:anchor="_Toc239179229" w:history="1">
         <w:r>
           <w:rPr>
             <w:rStyle w:val="Hipervnculo"/>
@@ -1806,7 +1806,7 @@
             <w:noProof/>
             <w:webHidden/>
           </w:rPr>
-          <w:instrText xml:space="preserve"> PAGEREF _Toc237881533 \h </w:instrText>
+          <w:instrText xml:space="preserve"> PAGEREF _Toc239179229 \h </w:instrText>
         </w:r>
         <w:r>
           <w:rPr>
@@ -1826,7 +1826,7 @@
             <w:noProof/>
             <w:webHidden/>
           </w:rPr>
-          <w:t>12</w:t>
+          <w:t>13</w:t>
         </w:r>
         <w:r>
           <w:rPr>
@@ -1850,7 +1850,7 @@
           <w:lang w:eastAsia="es-CO"/>
         </w:rPr>
       </w:pPr>
-      <w:hyperlink w:anchor="_Toc237881534" w:history="1">
+      <w:hyperlink w:anchor="_Toc239179230" w:history="1">
         <w:r>
           <w:rPr>
             <w:rStyle w:val="Hipervnculo"/>
@@ -1892,7 +1892,7 @@
             <w:noProof/>
             <w:webHidden/>
           </w:rPr>
-          <w:instrText xml:space="preserve"> PAGEREF _Toc237881534 \h </w:instrText>
+          <w:instrText xml:space="preserve"> PAGEREF _Toc239179230 \h </w:instrText>
         </w:r>
         <w:r>
           <w:rPr>
@@ -1912,7 +1912,7 @@
             <w:noProof/>
             <w:webHidden/>
           </w:rPr>
-          <w:t>12</w:t>
+          <w:t>13</w:t>
         </w:r>
         <w:r>
           <w:rPr>
@@ -1936,7 +1936,7 @@
           <w:lang w:eastAsia="es-CO"/>
         </w:rPr>
       </w:pPr>
-      <w:hyperlink w:anchor="_Toc237881535" w:history="1">
+      <w:hyperlink w:anchor="_Toc239179231" w:history="1">
         <w:r>
           <w:rPr>
             <w:rStyle w:val="Hipervnculo"/>
@@ -1978,7 +1978,7 @@
             <w:noProof/>
             <w:webHidden/>
           </w:rPr>
-          <w:instrText xml:space="preserve"> PAGEREF _Toc237881535 \h </w:instrText>
+          <w:instrText xml:space="preserve"> PAGEREF _Toc239179231 \h </w:instrText>
         </w:r>
         <w:r>
           <w:rPr>
@@ -1998,7 +1998,7 @@
             <w:noProof/>
             <w:webHidden/>
           </w:rPr>
-          <w:t>12</w:t>
+          <w:t>13</w:t>
         </w:r>
         <w:r>
           <w:rPr>
@@ -2022,7 +2022,7 @@
           <w:lang w:eastAsia="es-CO"/>
         </w:rPr>
       </w:pPr>
-      <w:hyperlink w:anchor="_Toc237881536" w:history="1">
+      <w:hyperlink w:anchor="_Toc239179232" w:history="1">
         <w:r>
           <w:rPr>
             <w:rStyle w:val="Hipervnculo"/>
@@ -2064,7 +2064,7 @@
             <w:noProof/>
             <w:webHidden/>
           </w:rPr>
-          <w:instrText xml:space="preserve"> PAGEREF _Toc237881536 \h </w:instrText>
+          <w:instrText xml:space="preserve"> PAGEREF _Toc239179232 \h </w:instrText>
         </w:r>
         <w:r>
           <w:rPr>
@@ -2084,7 +2084,7 @@
             <w:noProof/>
             <w:webHidden/>
           </w:rPr>
-          <w:t>12</w:t>
+          <w:t>13</w:t>
         </w:r>
         <w:r>
           <w:rPr>
@@ -2108,7 +2108,7 @@
           <w:lang w:eastAsia="es-CO"/>
         </w:rPr>
       </w:pPr>
-      <w:hyperlink w:anchor="_Toc237881537" w:history="1">
+      <w:hyperlink w:anchor="_Toc239179233" w:history="1">
         <w:r>
           <w:rPr>
             <w:rStyle w:val="Hipervnculo"/>
@@ -2150,7 +2150,7 @@
             <w:noProof/>
             <w:webHidden/>
           </w:rPr>
-          <w:instrText xml:space="preserve"> PAGEREF _Toc237881537 \h </w:instrText>
+          <w:instrText xml:space="preserve"> PAGEREF _Toc239179233 \h </w:instrText>
         </w:r>
         <w:r>
           <w:rPr>
@@ -2170,7 +2170,7 @@
             <w:noProof/>
             <w:webHidden/>
           </w:rPr>
-          <w:t>12</w:t>
+          <w:t>13</w:t>
         </w:r>
         <w:r>
           <w:rPr>
@@ -2194,7 +2194,7 @@
           <w:lang w:eastAsia="es-CO"/>
         </w:rPr>
       </w:pPr>
-      <w:hyperlink w:anchor="_Toc237881538" w:history="1">
+      <w:hyperlink w:anchor="_Toc239179234" w:history="1">
         <w:r>
           <w:rPr>
             <w:rStyle w:val="Hipervnculo"/>
@@ -2236,7 +2236,7 @@
             <w:noProof/>
             <w:webHidden/>
           </w:rPr>
-          <w:instrText xml:space="preserve"> PAGEREF _Toc237881538 \h </w:instrText>
+          <w:instrText xml:space="preserve"> PAGEREF _Toc239179234 \h </w:instrText>
         </w:r>
         <w:r>
           <w:rPr>
@@ -2256,7 +2256,7 @@
             <w:noProof/>
             <w:webHidden/>
           </w:rPr>
-          <w:t>13</w:t>
+          <w:t>14</w:t>
         </w:r>
         <w:r>
           <w:rPr>
@@ -2266,6 +2266,453 @@
           <w:fldChar w:fldCharType="end"/>
         </w:r>
       </w:hyperlink>
+    </w:p>
+    <w:p>
+      <w:pPr>
+        <w:pStyle w:val="TDC1"/>
+        <w:tabs>
+          <w:tab w:val="left" w:pos="440"/>
+          <w:tab w:val="right" w:leader="dot" w:pos="9350"/>
+        </w:tabs>
+        <w:rPr>
+          <w:rFonts w:asciiTheme="minorHAnsi" w:eastAsiaTheme="minorEastAsia" w:hAnsiTheme="minorHAnsi" w:cstheme="minorBidi"/>
+          <w:noProof/>
+          <w:lang w:eastAsia="es-CO"/>
+        </w:rPr>
+      </w:pPr>
+      <w:hyperlink w:anchor="_Toc239179235" w:history="1">
+        <w:r>
+          <w:rPr>
+            <w:rStyle w:val="Hipervnculo"/>
+            <w:noProof/>
+          </w:rPr>
+          <w:t>8</w:t>
+        </w:r>
+        <w:r>
+          <w:rPr>
+            <w:rFonts w:asciiTheme="minorHAnsi" w:eastAsiaTheme="minorEastAsia" w:hAnsiTheme="minorHAnsi" w:cstheme="minorBidi"/>
+            <w:noProof/>
+            <w:lang w:eastAsia="es-CO"/>
+          </w:rPr>
+          <w:tab/>
+        </w:r>
+        <w:r>
+          <w:rPr>
+            <w:rStyle w:val="Hipervnculo"/>
+            <w:noProof/>
+          </w:rPr>
+          <w:t>Desarrollo del Sistema</w:t>
+        </w:r>
+        <w:r>
+          <w:rPr>
+            <w:noProof/>
+            <w:webHidden/>
+          </w:rPr>
+          <w:tab/>
+        </w:r>
+        <w:r>
+          <w:rPr>
+            <w:noProof/>
+            <w:webHidden/>
+          </w:rPr>
+          <w:fldChar w:fldCharType="begin"/>
+        </w:r>
+        <w:r>
+          <w:rPr>
+            <w:noProof/>
+            <w:webHidden/>
+          </w:rPr>
+          <w:instrText xml:space="preserve"> PAGEREF _Toc239179235 \h </w:instrText>
+        </w:r>
+        <w:r>
+          <w:rPr>
+            <w:noProof/>
+            <w:webHidden/>
+          </w:rPr>
+        </w:r>
+        <w:r>
+          <w:rPr>
+            <w:noProof/>
+            <w:webHidden/>
+          </w:rPr>
+          <w:fldChar w:fldCharType="separate"/>
+        </w:r>
+        <w:r>
+          <w:rPr>
+            <w:noProof/>
+            <w:webHidden/>
+          </w:rPr>
+          <w:t>15</w:t>
+        </w:r>
+        <w:r>
+          <w:rPr>
+            <w:noProof/>
+            <w:webHidden/>
+          </w:rPr>
+          <w:fldChar w:fldCharType="end"/>
+        </w:r>
+      </w:hyperlink>
+    </w:p>
+    <w:p>
+      <w:pPr>
+        <w:pStyle w:val="TDC2"/>
+        <w:tabs>
+          <w:tab w:val="left" w:pos="880"/>
+          <w:tab w:val="right" w:leader="dot" w:pos="9350"/>
+        </w:tabs>
+        <w:rPr>
+          <w:rFonts w:asciiTheme="minorHAnsi" w:eastAsiaTheme="minorEastAsia" w:hAnsiTheme="minorHAnsi" w:cstheme="minorBidi"/>
+          <w:noProof/>
+          <w:lang w:eastAsia="es-CO"/>
+        </w:rPr>
+      </w:pPr>
+      <w:hyperlink w:anchor="_Toc239179236" w:history="1">
+        <w:r>
+          <w:rPr>
+            <w:rStyle w:val="Hipervnculo"/>
+            <w:noProof/>
+          </w:rPr>
+          <w:t>8.1</w:t>
+        </w:r>
+        <w:r>
+          <w:rPr>
+            <w:rFonts w:asciiTheme="minorHAnsi" w:eastAsiaTheme="minorEastAsia" w:hAnsiTheme="minorHAnsi" w:cstheme="minorBidi"/>
+            <w:noProof/>
+            <w:lang w:eastAsia="es-CO"/>
+          </w:rPr>
+          <w:tab/>
+        </w:r>
+        <w:r>
+          <w:rPr>
+            <w:rStyle w:val="Hipervnculo"/>
+            <w:noProof/>
+          </w:rPr>
+          <w:t>Aplicación del Patrón Singleton</w:t>
+        </w:r>
+        <w:r>
+          <w:rPr>
+            <w:noProof/>
+            <w:webHidden/>
+          </w:rPr>
+          <w:tab/>
+        </w:r>
+        <w:r>
+          <w:rPr>
+            <w:noProof/>
+            <w:webHidden/>
+          </w:rPr>
+          <w:fldChar w:fldCharType="begin"/>
+        </w:r>
+        <w:r>
+          <w:rPr>
+            <w:noProof/>
+            <w:webHidden/>
+          </w:rPr>
+          <w:instrText xml:space="preserve"> PAGEREF _Toc239179236 \h </w:instrText>
+        </w:r>
+        <w:r>
+          <w:rPr>
+            <w:noProof/>
+            <w:webHidden/>
+          </w:rPr>
+        </w:r>
+        <w:r>
+          <w:rPr>
+            <w:noProof/>
+            <w:webHidden/>
+          </w:rPr>
+          <w:fldChar w:fldCharType="separate"/>
+        </w:r>
+        <w:r>
+          <w:rPr>
+            <w:noProof/>
+            <w:webHidden/>
+          </w:rPr>
+          <w:t>15</w:t>
+        </w:r>
+        <w:r>
+          <w:rPr>
+            <w:noProof/>
+            <w:webHidden/>
+          </w:rPr>
+          <w:fldChar w:fldCharType="end"/>
+        </w:r>
+      </w:hyperlink>
+    </w:p>
+    <w:p>
+      <w:pPr>
+        <w:pStyle w:val="TDC3"/>
+        <w:tabs>
+          <w:tab w:val="left" w:pos="1320"/>
+          <w:tab w:val="right" w:leader="dot" w:pos="9350"/>
+        </w:tabs>
+        <w:rPr>
+          <w:rFonts w:asciiTheme="minorHAnsi" w:eastAsiaTheme="minorEastAsia" w:hAnsiTheme="minorHAnsi" w:cstheme="minorBidi"/>
+          <w:noProof/>
+          <w:lang w:eastAsia="es-CO"/>
+        </w:rPr>
+      </w:pPr>
+      <w:hyperlink w:anchor="_Toc239179237" w:history="1">
+        <w:r>
+          <w:rPr>
+            <w:rStyle w:val="Hipervnculo"/>
+            <w:noProof/>
+          </w:rPr>
+          <w:t>8.1.1</w:t>
+        </w:r>
+        <w:r>
+          <w:rPr>
+            <w:rFonts w:asciiTheme="minorHAnsi" w:eastAsiaTheme="minorEastAsia" w:hAnsiTheme="minorHAnsi" w:cstheme="minorBidi"/>
+            <w:noProof/>
+            <w:lang w:eastAsia="es-CO"/>
+          </w:rPr>
+          <w:tab/>
+        </w:r>
+        <w:r>
+          <w:rPr>
+            <w:rStyle w:val="Hipervnculo"/>
+            <w:noProof/>
+          </w:rPr>
+          <w:t>Evidencias de Uso</w:t>
+        </w:r>
+        <w:r>
+          <w:rPr>
+            <w:noProof/>
+            <w:webHidden/>
+          </w:rPr>
+          <w:tab/>
+        </w:r>
+        <w:r>
+          <w:rPr>
+            <w:noProof/>
+            <w:webHidden/>
+          </w:rPr>
+          <w:fldChar w:fldCharType="begin"/>
+        </w:r>
+        <w:r>
+          <w:rPr>
+            <w:noProof/>
+            <w:webHidden/>
+          </w:rPr>
+          <w:instrText xml:space="preserve"> PAGEREF _Toc239179237 \h </w:instrText>
+        </w:r>
+        <w:r>
+          <w:rPr>
+            <w:noProof/>
+            <w:webHidden/>
+          </w:rPr>
+        </w:r>
+        <w:r>
+          <w:rPr>
+            <w:noProof/>
+            <w:webHidden/>
+          </w:rPr>
+          <w:fldChar w:fldCharType="separate"/>
+        </w:r>
+        <w:r>
+          <w:rPr>
+            <w:noProof/>
+            <w:webHidden/>
+          </w:rPr>
+          <w:t>15</w:t>
+        </w:r>
+        <w:r>
+          <w:rPr>
+            <w:noProof/>
+            <w:webHidden/>
+          </w:rPr>
+          <w:fldChar w:fldCharType="end"/>
+        </w:r>
+      </w:hyperlink>
+    </w:p>
+    <w:p>
+      <w:pPr>
+        <w:pStyle w:val="TDC3"/>
+        <w:tabs>
+          <w:tab w:val="left" w:pos="1320"/>
+          <w:tab w:val="right" w:leader="dot" w:pos="9350"/>
+        </w:tabs>
+        <w:rPr>
+          <w:rFonts w:asciiTheme="minorHAnsi" w:eastAsiaTheme="minorEastAsia" w:hAnsiTheme="minorHAnsi" w:cstheme="minorBidi"/>
+          <w:noProof/>
+          <w:lang w:eastAsia="es-CO"/>
+        </w:rPr>
+      </w:pPr>
+      <w:hyperlink w:anchor="_Toc239179238" w:history="1">
+        <w:r>
+          <w:rPr>
+            <w:rStyle w:val="Hipervnculo"/>
+            <w:noProof/>
+          </w:rPr>
+          <w:t>8.1.2</w:t>
+        </w:r>
+        <w:r>
+          <w:rPr>
+            <w:rFonts w:asciiTheme="minorHAnsi" w:eastAsiaTheme="minorEastAsia" w:hAnsiTheme="minorHAnsi" w:cstheme="minorBidi"/>
+            <w:noProof/>
+            <w:lang w:eastAsia="es-CO"/>
+          </w:rPr>
+          <w:tab/>
+        </w:r>
+        <w:r>
+          <w:rPr>
+            <w:rStyle w:val="Hipervnculo"/>
+            <w:noProof/>
+          </w:rPr>
+          <w:t>Como Está Colaborando Este Patrón al Proyecto</w:t>
+        </w:r>
+        <w:r>
+          <w:rPr>
+            <w:noProof/>
+            <w:webHidden/>
+          </w:rPr>
+          <w:tab/>
+        </w:r>
+        <w:r>
+          <w:rPr>
+            <w:noProof/>
+            <w:webHidden/>
+          </w:rPr>
+          <w:fldChar w:fldCharType="begin"/>
+        </w:r>
+        <w:r>
+          <w:rPr>
+            <w:noProof/>
+            <w:webHidden/>
+          </w:rPr>
+          <w:instrText xml:space="preserve"> PAGEREF _Toc239179238 \h </w:instrText>
+        </w:r>
+        <w:r>
+          <w:rPr>
+            <w:noProof/>
+            <w:webHidden/>
+          </w:rPr>
+        </w:r>
+        <w:r>
+          <w:rPr>
+            <w:noProof/>
+            <w:webHidden/>
+          </w:rPr>
+          <w:fldChar w:fldCharType="separate"/>
+        </w:r>
+        <w:r>
+          <w:rPr>
+            <w:noProof/>
+            <w:webHidden/>
+          </w:rPr>
+          <w:t>16</w:t>
+        </w:r>
+        <w:r>
+          <w:rPr>
+            <w:noProof/>
+            <w:webHidden/>
+          </w:rPr>
+          <w:fldChar w:fldCharType="end"/>
+        </w:r>
+      </w:hyperlink>
+    </w:p>
+    <w:p>
+      <w:pPr>
+        <w:pStyle w:val="TDC3"/>
+        <w:tabs>
+          <w:tab w:val="left" w:pos="1320"/>
+          <w:tab w:val="right" w:leader="dot" w:pos="9350"/>
+        </w:tabs>
+        <w:rPr>
+          <w:rStyle w:val="Hipervnculo"/>
+          <w:noProof/>
+        </w:rPr>
+      </w:pPr>
+      <w:hyperlink w:anchor="_Toc239179239" w:history="1">
+        <w:r>
+          <w:rPr>
+            <w:rStyle w:val="Hipervnculo"/>
+            <w:noProof/>
+          </w:rPr>
+          <w:t>8.1.3</w:t>
+        </w:r>
+        <w:r>
+          <w:rPr>
+            <w:rFonts w:asciiTheme="minorHAnsi" w:eastAsiaTheme="minorEastAsia" w:hAnsiTheme="minorHAnsi" w:cstheme="minorBidi"/>
+            <w:noProof/>
+            <w:lang w:eastAsia="es-CO"/>
+          </w:rPr>
+          <w:tab/>
+        </w:r>
+        <w:r>
+          <w:rPr>
+            <w:rStyle w:val="Hipervnculo"/>
+            <w:noProof/>
+          </w:rPr>
+          <w:t>Explicación y Prueba de que Funciona</w:t>
+        </w:r>
+        <w:r>
+          <w:rPr>
+            <w:noProof/>
+            <w:webHidden/>
+          </w:rPr>
+          <w:tab/>
+        </w:r>
+        <w:r>
+          <w:rPr>
+            <w:noProof/>
+            <w:webHidden/>
+          </w:rPr>
+          <w:fldChar w:fldCharType="begin"/>
+        </w:r>
+        <w:r>
+          <w:rPr>
+            <w:noProof/>
+            <w:webHidden/>
+          </w:rPr>
+          <w:instrText xml:space="preserve"> PAGEREF _Toc239179239 \h </w:instrText>
+        </w:r>
+        <w:r>
+          <w:rPr>
+            <w:noProof/>
+            <w:webHidden/>
+          </w:rPr>
+        </w:r>
+        <w:r>
+          <w:rPr>
+            <w:noProof/>
+            <w:webHidden/>
+          </w:rPr>
+          <w:fldChar w:fldCharType="separate"/>
+        </w:r>
+        <w:r>
+          <w:rPr>
+            <w:noProof/>
+            <w:webHidden/>
+          </w:rPr>
+          <w:t>17</w:t>
+        </w:r>
+        <w:r>
+          <w:rPr>
+            <w:noProof/>
+            <w:webHidden/>
+          </w:rPr>
+          <w:fldChar w:fldCharType="end"/>
+        </w:r>
+      </w:hyperlink>
+    </w:p>
+    <w:p>
+      <w:pPr>
+        <w:spacing w:after="0" w:line="240" w:lineRule="auto"/>
+        <w:jc w:val="left"/>
+        <w:rPr>
+          <w:noProof/>
+          <w:color w:val="467886"/>
+          <w:u w:val="single"/>
+        </w:rPr>
+      </w:pPr>
+      <w:r>
+        <w:rPr>
+          <w:rStyle w:val="Hipervnculo"/>
+          <w:noProof/>
+        </w:rPr>
+        <w:br w:type="page"/>
+      </w:r>
     </w:p>
     <w:p>
       <w:pPr>
@@ -2279,7 +2726,7 @@
         <w:lastRenderedPageBreak/>
         <w:fldChar w:fldCharType="end"/>
       </w:r>
-      <w:bookmarkStart w:id="0" w:name="_Toc237881516"/>
+      <w:bookmarkStart w:id="0" w:name="_Toc239179212"/>
       <w:r>
         <w:t>I</w:t>
       </w:r>
@@ -2290,54 +2737,35 @@
     </w:p>
     <w:p>
       <w:r>
-        <w:t>L</w:t>
-      </w:r>
-      <w:r>
-        <w:t>a gestión de la cadena de suministro comprende el conjunto de procesos relacionados con el abastecimiento, almacenamiento, control, transporte y d</w:t>
-      </w:r>
-      <w:r>
-        <w:t>istribución de productos desde los proveedores hasta los clientes. La coordinación adecuada de estas actividades es fundamental para que las organizaciones puedan mantener la disponibilidad de sus productos, utilizar eficientemente sus recursos y responder</w:t>
-      </w:r>
-      <w:r>
-        <w:t xml:space="preserve"> oportunamente a las necesidades de la demanda.</w:t>
-      </w:r>
-    </w:p>
-    <w:p>
-      <w:r>
-        <w:t>En un entorno caracterizado por la variabilidad de la demanda, la necesidad de reducir costos operativos y la importancia de realizar entregas oportunas, las organizaciones requieren mecanismos que les permit</w:t>
-      </w:r>
-      <w:r>
-        <w:t>an obtener información de manera integrada sobre el comportamiento de sus cadenas de suministro. Una gestión limitada o fragmentada puede dificultar la identificación de necesidades de abastecimiento, generar acumulación o escasez de inventario, aumentar l</w:t>
-      </w:r>
-      <w:r>
-        <w:t>os costos asociados al almacenamiento y transporte y reducir la visibilidad sobre el estado de los productos durante su distribución.</w:t>
-      </w:r>
-    </w:p>
-    <w:p>
-      <w:r>
-        <w:t>En este contexto, el presente proyecto propone el desarrollo de un Sistema de Gestión de Cadena de Suministro (SCM) orient</w:t>
-      </w:r>
-      <w:r>
-        <w:t>ado a apoyar la planificación, coordinación, seguimiento y optimización de los procesos relacionados con el flujo de productos dentro de una cadena de suministro.</w:t>
-      </w:r>
-    </w:p>
-    <w:p>
-      <w:r>
-        <w:t>La solución contemplará mecanismos para el seguimiento de productos, la optimización de rutas</w:t>
-      </w:r>
-      <w:r>
-        <w:t xml:space="preserve"> y almacenamiento, la predicción de la demanda mediante análisis predictivo y la integración con dispositivos IoT para el monitoreo de información en tiempo real. Estas funcionalidades permitirán utilizar la información generada a lo largo de la cadena de </w:t>
-      </w:r>
-      <w:r>
-        <w:t>suministro como apoyo para la toma de decisiones y para la mejora de la eficiencia de los procesos logísticos.</w:t>
-      </w:r>
-    </w:p>
-    <w:p>
-      <w:r>
-        <w:t>El sistema será diseñado de manera general para poder adaptarse a diferentes escenarios de distribución de productos terminados. Como escenario d</w:t>
-      </w:r>
-      <w:r>
-        <w:t>e referencia para las pruebas y validación del sistema se utilizará una empresa dedicada a la distribución de dispositivos móviles; sin embargo, dicho escenario no constituye una restricción del sistema ni define exclusivamente su propósito.</w:t>
+        <w:t>La gestión de la cadena de suministro comprende el conjunto de procesos relacionados con el abastecimiento, almacenamiento, control, transporte y distribución de productos desde los proveedores hasta los clientes. La coordinación adecuada de estas actividades es fundamental para que las organizaciones puedan mantener la disponibilidad de sus productos, utilizar eficientemente sus recursos y responder oportunamente a las necesidades de la demanda.</w:t>
+      </w:r>
+    </w:p>
+    <w:p>
+      <w:r>
+        <w:t>En un entorno caracterizado por la variabilidad de la demanda, la necesidad de reducir costos operativos y la importancia de realizar entregas oportunas, las organizaciones requieren mecanismos que les permitan obtener información de manera integrada sobre el comportamiento de sus cadenas de suministro. Una gestión limitada o fragmentada puede dificultar la identificación de necesidades de abastecimiento, generar acumulación o escasez de inventario, aumentar los costos asociados al almacenamiento y transporte y reducir la visibilidad sobre el estado de los productos durante su distribución.</w:t>
+      </w:r>
+    </w:p>
+    <w:p>
+      <w:r>
+        <w:t>En este contexto, el presente proyecto propone el desarrollo de un Sistema de Gestión de Cadena de Suministro (SCM) orientado a apoyar la planificación, coordinación, seguimiento y optimización de los procesos relacionados con el flujo de productos dentro de una cadena de suministro.</w:t>
+      </w:r>
+    </w:p>
+    <w:p>
+      <w:r>
+        <w:t xml:space="preserve">La solución contemplará mecanismos para el seguimiento de productos, la optimización de rutas y almacenamiento, la predicción de la demanda mediante análisis predictivo y la integración con dispositivos </w:t>
+      </w:r>
+      <w:proofErr w:type="spellStart"/>
+      <w:r>
+        <w:t>IoT</w:t>
+      </w:r>
+      <w:proofErr w:type="spellEnd"/>
+      <w:r>
+        <w:t xml:space="preserve"> para el monitoreo de información en tiempo real. Estas funcionalidades permitirán utilizar la información generada a lo largo de la cadena de suministro como apoyo para la toma de decisiones y para la mejora de la eficiencia de los procesos logísticos.</w:t>
+      </w:r>
+    </w:p>
+    <w:p>
+      <w:r>
+        <w:t>El sistema será diseñado de manera general para poder adaptarse a diferentes escenarios de distribución de productos terminados. Como escenario de referencia para las pruebas y validación del sistema se utilizará una empresa dedicada a la distribución de dispositivos móviles; sin embargo, dicho escenario no constituye una restricción del sistema ni define exclusivamente su propósito.</w:t>
       </w:r>
     </w:p>
     <w:p>
@@ -2347,7 +2775,7 @@
       <w:r>
         <w:br w:type="page"/>
       </w:r>
-      <w:bookmarkStart w:id="1" w:name="_Toc237881517"/>
+      <w:bookmarkStart w:id="1" w:name="_Toc239179213"/>
       <w:r>
         <w:lastRenderedPageBreak/>
         <w:t>I</w:t>
@@ -2361,12 +2789,9 @@
       <w:pPr>
         <w:pStyle w:val="Ttulo2"/>
       </w:pPr>
-      <w:bookmarkStart w:id="2" w:name="_Toc237881518"/>
-      <w:r>
-        <w:t>N</w:t>
-      </w:r>
-      <w:r>
-        <w:t>ombre de proyecto</w:t>
+      <w:bookmarkStart w:id="2" w:name="_Toc239179214"/>
+      <w:r>
+        <w:t>Nombre de proyecto</w:t>
       </w:r>
       <w:bookmarkEnd w:id="2"/>
     </w:p>
@@ -2379,7 +2804,7 @@
       <w:pPr>
         <w:pStyle w:val="Ttulo2"/>
       </w:pPr>
-      <w:bookmarkStart w:id="3" w:name="_Toc237881519"/>
+      <w:bookmarkStart w:id="3" w:name="_Toc239179215"/>
       <w:r>
         <w:t>Descripción general</w:t>
       </w:r>
@@ -2387,41 +2812,37 @@
     </w:p>
     <w:p>
       <w:r>
-        <w:t>El proyecto consiste en el desarrollo de un sistema de gestión de cadena de suministro destinado a centralizar y apoyar la administración de los procesos relacionados con el abastecimiento, almacenam</w:t>
-      </w:r>
-      <w:r>
-        <w:t>iento, inventario, transporte, distribución y seguimiento de productos.</w:t>
-      </w:r>
-    </w:p>
-    <w:p>
-      <w:r>
-        <w:t>El sistema permitirá gestionar información relacionada con proveedores, productos, inventarios, órdenes de compra, pedidos, almacenes, despachos y transporte, integrando estos elemento</w:t>
-      </w:r>
-      <w:r>
-        <w:t>s dentro de un flujo común de información.</w:t>
-      </w:r>
-    </w:p>
-    <w:p>
-      <w:r>
-        <w:t xml:space="preserve">Además de las funcionalidades básicas de gestión, el sistema incorporará mecanismos de análisis y optimización orientados a generar valor sobre los procesos de la cadena de suministro. Entre ellos se contempla la </w:t>
-      </w:r>
-      <w:r>
-        <w:t>predicción de demanda a partir de datos históricos, la optimización de rutas de transporte, la optimización de la distribución de productos dentro de los almacenes y el seguimiento de los productos durante las diferentes etapas de su distribución.</w:t>
-      </w:r>
-    </w:p>
-    <w:p>
-      <w:r>
-        <w:t>La soluc</w:t>
-      </w:r>
-      <w:r>
-        <w:t>ión también contemplará la integración con dispositivos IoT para obtener información en tiempo real relacionada con el estado y ubicación de los productos o medios de transporte durante los procesos de distribución.</w:t>
+        <w:t>El proyecto consiste en el desarrollo de un sistema de gestión de cadena de suministro destinado a centralizar y apoyar la administración de los procesos relacionados con el abastecimiento, almacenamiento, inventario, transporte, distribución y seguimiento de productos.</w:t>
+      </w:r>
+    </w:p>
+    <w:p>
+      <w:r>
+        <w:t>El sistema permitirá gestionar información relacionada con proveedores, productos, inventarios, órdenes de compra, pedidos, almacenes, despachos y transporte, integrando estos elementos dentro de un flujo común de información.</w:t>
+      </w:r>
+    </w:p>
+    <w:p>
+      <w:r>
+        <w:t>Además de las funcionalidades básicas de gestión, el sistema incorporará mecanismos de análisis y optimización orientados a generar valor sobre los procesos de la cadena de suministro. Entre ellos se contempla la predicción de demanda a partir de datos históricos, la optimización de rutas de transporte, la optimización de la distribución de productos dentro de los almacenes y el seguimiento de los productos durante las diferentes etapas de su distribución.</w:t>
+      </w:r>
+    </w:p>
+    <w:p>
+      <w:r>
+        <w:t xml:space="preserve">La solución también contemplará la integración con dispositivos </w:t>
+      </w:r>
+      <w:proofErr w:type="spellStart"/>
+      <w:r>
+        <w:t>IoT</w:t>
+      </w:r>
+      <w:proofErr w:type="spellEnd"/>
+      <w:r>
+        <w:t xml:space="preserve"> para obtener información en tiempo real relacionada con el estado y ubicación de los productos o medios de transporte durante los procesos de distribución.</w:t>
       </w:r>
     </w:p>
     <w:p>
       <w:pPr>
         <w:pStyle w:val="Ttulo2"/>
       </w:pPr>
-      <w:bookmarkStart w:id="4" w:name="_Toc237881520"/>
+      <w:bookmarkStart w:id="4" w:name="_Toc239179216"/>
       <w:r>
         <w:t>Propósito</w:t>
       </w:r>
@@ -2432,33 +2853,21 @@
     </w:p>
     <w:p>
       <w:r>
-        <w:t xml:space="preserve">El propósito del </w:t>
-      </w:r>
-      <w:r>
-        <w:t>proyecto es proporcionar una herramienta que permita mejorar la gestión de una cadena de suministro mediante la centralización de información, el análisis de datos y la aplicación de mecanismos de optimización y monitoreo.</w:t>
-      </w:r>
-    </w:p>
-    <w:p>
-      <w:r>
-        <w:t>El sistema busca apoyar a las org</w:t>
-      </w:r>
-      <w:r>
-        <w:t xml:space="preserve">anizaciones en la toma de decisiones relacionadas con el abastecimiento, la gestión del inventario, el almacenamiento y la distribución de productos, permitiendo anticipar </w:t>
+        <w:t>El propósito del proyecto es proporcionar una herramienta que permita mejorar la gestión de una cadena de suministro mediante la centralización de información, el análisis de datos y la aplicación de mecanismos de optimización y monitoreo.</w:t>
+      </w:r>
+    </w:p>
+    <w:p>
+      <w:r>
+        <w:t xml:space="preserve">El sistema busca apoyar a las organizaciones en la toma de decisiones relacionadas con el abastecimiento, la gestión del inventario, el almacenamiento y la distribución de productos, permitiendo anticipar </w:t>
       </w:r>
       <w:r>
         <w:lastRenderedPageBreak/>
-        <w:t>necesidades de demanda, aprovechar eficientemente los espacios de almacenamiento, pl</w:t>
-      </w:r>
-      <w:r>
-        <w:t>anificar rutas de transporte y mantener visibilidad sobre el estado de los productos durante su desplazamiento.</w:t>
-      </w:r>
-    </w:p>
-    <w:p>
-      <w:r>
-        <w:t>De esta manera, el proyecto pretende contribuir a una gestión más eficiente, coordinada y oportuna de los procesos que conforman la cadena de su</w:t>
-      </w:r>
-      <w:r>
-        <w:t>ministro.</w:t>
+        <w:t>necesidades de demanda, aprovechar eficientemente los espacios de almacenamiento, planificar rutas de transporte y mantener visibilidad sobre el estado de los productos durante su desplazamiento.</w:t>
+      </w:r>
+    </w:p>
+    <w:p>
+      <w:r>
+        <w:t>De esta manera, el proyecto pretende contribuir a una gestión más eficiente, coordinada y oportuna de los procesos que conforman la cadena de suministro.</w:t>
       </w:r>
     </w:p>
     <w:p>
@@ -2468,7 +2877,7 @@
       <w:r>
         <w:br w:type="page"/>
       </w:r>
-      <w:bookmarkStart w:id="5" w:name="_Toc237881521"/>
+      <w:bookmarkStart w:id="5" w:name="_Toc239179217"/>
       <w:r>
         <w:lastRenderedPageBreak/>
         <w:t>Descripción del Problema</w:t>
@@ -2477,72 +2886,36 @@
     </w:p>
     <w:p>
       <w:r>
-        <w:t>L</w:t>
-      </w:r>
-      <w:r>
-        <w:t>as organizaciones que participan en procesos de distribución de productos deben coordinar diferentes actividades que abarcan desde la adquisición de mercancías a los proveedores hasta su almacenamiento, preparación, tran</w:t>
-      </w:r>
-      <w:r>
-        <w:t>sporte y entrega a los clientes. Cada una de estas etapas genera información que puede ser utilizada para mejorar la planificación y operación de la cadena de suministro.</w:t>
-      </w:r>
-    </w:p>
-    <w:p>
-      <w:r>
-        <w:t>Sin embargo, cuando la información relacionada con estos procesos se encuentra disper</w:t>
-      </w:r>
-      <w:r>
-        <w:t xml:space="preserve">sa, se gestiona de manera independiente o no se dispone de mecanismos adecuados para su análisis, pueden presentarse diferentes dificultades en la operación. Entre ellas se encuentran la falta de visibilidad sobre el estado de los productos, decisiones de </w:t>
-      </w:r>
-      <w:r>
-        <w:t>abastecimiento basadas únicamente en información histórica limitada, distribución ineficiente de los productos dentro de los almacenes y planificación poco eficiente de las rutas de transporte.</w:t>
-      </w:r>
-    </w:p>
-    <w:p>
-      <w:r>
-        <w:t>Uno de los principales problemas corresponde a la dificultad p</w:t>
-      </w:r>
-      <w:r>
-        <w:t>ara anticipar el comportamiento de la demanda. Las variaciones en las necesidades de los clientes pueden provocar que determinados productos presenten niveles insuficientes de inventario, mientras que otros permanezcan almacenados durante períodos prolonga</w:t>
-      </w:r>
-      <w:r>
-        <w:t>dos debido a una demanda inferior a la esperada. Sin herramientas de análisis predictivo, la planificación del abastecimiento puede depender principalmente de decisiones manuales o de información que no representa adecuadamente las tendencias futuras.</w:t>
-      </w:r>
-    </w:p>
-    <w:p>
-      <w:r>
-        <w:t>De i</w:t>
-      </w:r>
-      <w:r>
-        <w:t xml:space="preserve">gual manera, la distribución de los productos dentro de los almacenes influye directamente en la eficiencia de las operaciones. Una ubicación poco adecuada de los productos puede incrementar los tiempos necesarios para localizarlos y preparar los pedidos, </w:t>
-      </w:r>
-      <w:r>
-        <w:t>además de generar un aprovechamiento deficiente del espacio disponible. Por esta razón, resulta necesario disponer de mecanismos que permitan analizar la distribución del inventario y apoyar la determinación de ubicaciones adecuadas.</w:t>
-      </w:r>
-    </w:p>
-    <w:p>
-      <w:r>
-        <w:t>Otro problema se prese</w:t>
-      </w:r>
-      <w:r>
-        <w:t>nta durante el transporte y la distribución. La planificación de rutas sin considerar criterios de optimización puede generar desplazamientos innecesarios, mayores tiempos de recorrido y un incremento de los costos asociados a la distribución. A esto se su</w:t>
-      </w:r>
-      <w:r>
-        <w:t>ma la dificultad de conocer en tiempo real la ubicación o estado de los productos durante su traslado cuando no existen mecanismos de monitoreo.</w:t>
-      </w:r>
-    </w:p>
-    <w:p>
-      <w:r>
-        <w:t>La falta de seguimiento constituye, por tanto, otro aspecto relevante. Durante el proceso de distribución puede</w:t>
-      </w:r>
-      <w:r>
-        <w:t xml:space="preserve">n existir diferentes estados por los que atraviesa un producto, desde su salida del almacén hasta su </w:t>
+        <w:t>Las organizaciones que participan en procesos de distribución de productos deben coordinar diferentes actividades que abarcan desde la adquisición de mercancías a los proveedores hasta su almacenamiento, preparación, transporte y entrega a los clientes. Cada una de estas etapas genera información que puede ser utilizada para mejorar la planificación y operación de la cadena de suministro.</w:t>
+      </w:r>
+    </w:p>
+    <w:p>
+      <w:r>
+        <w:t>Sin embargo, cuando la información relacionada con estos procesos se encuentra dispersa, se gestiona de manera independiente o no se dispone de mecanismos adecuados para su análisis, pueden presentarse diferentes dificultades en la operación. Entre ellas se encuentran la falta de visibilidad sobre el estado de los productos, decisiones de abastecimiento basadas únicamente en información histórica limitada, distribución ineficiente de los productos dentro de los almacenes y planificación poco eficiente de las rutas de transporte.</w:t>
+      </w:r>
+    </w:p>
+    <w:p>
+      <w:r>
+        <w:t>Uno de los principales problemas corresponde a la dificultad para anticipar el comportamiento de la demanda. Las variaciones en las necesidades de los clientes pueden provocar que determinados productos presenten niveles insuficientes de inventario, mientras que otros permanezcan almacenados durante períodos prolongados debido a una demanda inferior a la esperada. Sin herramientas de análisis predictivo, la planificación del abastecimiento puede depender principalmente de decisiones manuales o de información que no representa adecuadamente las tendencias futuras.</w:t>
+      </w:r>
+    </w:p>
+    <w:p>
+      <w:r>
+        <w:t>De igual manera, la distribución de los productos dentro de los almacenes influye directamente en la eficiencia de las operaciones. Una ubicación poco adecuada de los productos puede incrementar los tiempos necesarios para localizarlos y preparar los pedidos, además de generar un aprovechamiento deficiente del espacio disponible. Por esta razón, resulta necesario disponer de mecanismos que permitan analizar la distribución del inventario y apoyar la determinación de ubicaciones adecuadas.</w:t>
+      </w:r>
+    </w:p>
+    <w:p>
+      <w:r>
+        <w:t>Otro problema se presenta durante el transporte y la distribución. La planificación de rutas sin considerar criterios de optimización puede generar desplazamientos innecesarios, mayores tiempos de recorrido y un incremento de los costos asociados a la distribución. A esto se suma la dificultad de conocer en tiempo real la ubicación o estado de los productos durante su traslado cuando no existen mecanismos de monitoreo.</w:t>
+      </w:r>
+    </w:p>
+    <w:p>
+      <w:r>
+        <w:t xml:space="preserve">La falta de seguimiento constituye, por tanto, otro aspecto relevante. Durante el proceso de distribución pueden existir diferentes estados por los que atraviesa un producto, desde su salida del almacén hasta su </w:t>
       </w:r>
       <w:r>
         <w:lastRenderedPageBreak/>
-        <w:t>entrega. Sin información actualizada, la organización puede tener dificultades para conocer la ubicación de los productos, identificar retrasos y proporcio</w:t>
-      </w:r>
-      <w:r>
-        <w:t>nar información oportuna sobre los envíos.</w:t>
+        <w:t>entrega. Sin información actualizada, la organización puede tener dificultades para conocer la ubicación de los productos, identificar retrasos y proporcionar información oportuna sobre los envíos.</w:t>
       </w:r>
     </w:p>
     <w:p>
@@ -2552,7 +2925,7 @@
       <w:r>
         <w:br w:type="page"/>
       </w:r>
-      <w:bookmarkStart w:id="6" w:name="_Toc237881522"/>
+      <w:bookmarkStart w:id="6" w:name="_Toc239179218"/>
       <w:r>
         <w:lastRenderedPageBreak/>
         <w:t>J</w:t>
@@ -2564,70 +2937,45 @@
     </w:p>
     <w:p>
       <w:r>
-        <w:t>L</w:t>
-      </w:r>
-      <w:r>
-        <w:t xml:space="preserve">a gestión de la cadena de suministro representa un componente fundamental para las organizaciones que adquieren, almacenan y distribuyen productos, debido a que la coordinación de estas actividades </w:t>
-      </w:r>
-      <w:r>
-        <w:t>tiene una relación directa con la disponibilidad de los productos, los tiempos de operación y los costos asociados a los procesos logísticos.</w:t>
-      </w:r>
-    </w:p>
-    <w:p>
-      <w:r>
-        <w:t>Las dificultades para anticipar la demanda, organizar adecuadamente el almacenamiento, planificar las rutas de tra</w:t>
-      </w:r>
-      <w:r>
-        <w:t>nsporte y realizar seguimiento sobre los productos pueden afectar el desempeño de una organización. Estas situaciones pueden generar desabastecimiento, exceso de inventario, utilización ineficiente del espacio, desplazamientos innecesarios y dificultades p</w:t>
-      </w:r>
-      <w:r>
-        <w:t>ara responder oportunamente ante eventos ocurridos durante el transporte.</w:t>
-      </w:r>
-    </w:p>
-    <w:p>
-      <w:r>
-        <w:t>Ante esta problemática, surge la necesidad de desarrollar una solución que permita integrar diferentes procesos de la cadena de suministro y aprovechar la información generada durant</w:t>
-      </w:r>
-      <w:r>
-        <w:t>e su operación. Un sistema de gestión de cadena de suministro puede proporcionar una visión integrada de los productos y de los procesos asociados a su adquisición, almacenamiento y distribución, facilitando el acceso a información relevante para la toma d</w:t>
-      </w:r>
-      <w:r>
-        <w:t>e decisiones.</w:t>
-      </w:r>
-    </w:p>
-    <w:p>
-      <w:r>
-        <w:t>Uno de los principales aportes de la solución será la incorporación de análisis predictivo para la estimación de la demanda. El uso de información histórica permitirá identificar patrones y tendencias que puedan utilizarse como apoyo para ant</w:t>
-      </w:r>
-      <w:r>
-        <w:t>icipar las necesidades futuras de productos. Esto puede contribuir a reducir el riesgo de desabastecimiento y evitar adquisiciones que generen niveles de inventario superiores a las necesidades previstas.</w:t>
-      </w:r>
-    </w:p>
-    <w:p>
-      <w:r>
-        <w:t>La optimización del almacenamiento permitirá apoyar</w:t>
-      </w:r>
-      <w:r>
-        <w:t xml:space="preserve"> la distribución de los productos dentro de los espacios disponibles, considerando variables relacionadas con la demanda y rotación de los productos. Esto busca facilitar las operaciones de almacenamiento y preparación de pedidos y contribuir a un mejor ap</w:t>
-      </w:r>
-      <w:r>
-        <w:t>rovechamiento del espacio.</w:t>
-      </w:r>
-    </w:p>
-    <w:p>
-      <w:r>
-        <w:t>Por otra parte, la optimización de rutas permitirá analizar alternativas de transporte para determinar recorridos eficientes de acuerdo con las condiciones consideradas por el sistema. Esto puede contribuir a reducir distancias y</w:t>
-      </w:r>
-      <w:r>
-        <w:t xml:space="preserve"> tiempos de desplazamiento durante los procesos de distribución.</w:t>
-      </w:r>
-    </w:p>
-    <w:p>
-      <w:r>
-        <w:t>El seguimiento de productos proporcionará visibilidad sobre el estado de los productos durante las diferentes etapas de la cadena de suministro. Complementariamente, la integración con dispos</w:t>
-      </w:r>
-      <w:r>
-        <w:t xml:space="preserve">itivos IoT </w:t>
+        <w:t>La gestión de la cadena de suministro representa un componente fundamental para las organizaciones que adquieren, almacenan y distribuyen productos, debido a que la coordinación de estas actividades tiene una relación directa con la disponibilidad de los productos, los tiempos de operación y los costos asociados a los procesos logísticos.</w:t>
+      </w:r>
+    </w:p>
+    <w:p>
+      <w:r>
+        <w:t>Las dificultades para anticipar la demanda, organizar adecuadamente el almacenamiento, planificar las rutas de transporte y realizar seguimiento sobre los productos pueden afectar el desempeño de una organización. Estas situaciones pueden generar desabastecimiento, exceso de inventario, utilización ineficiente del espacio, desplazamientos innecesarios y dificultades para responder oportunamente ante eventos ocurridos durante el transporte.</w:t>
+      </w:r>
+    </w:p>
+    <w:p>
+      <w:r>
+        <w:t>Ante esta problemática, surge la necesidad de desarrollar una solución que permita integrar diferentes procesos de la cadena de suministro y aprovechar la información generada durante su operación. Un sistema de gestión de cadena de suministro puede proporcionar una visión integrada de los productos y de los procesos asociados a su adquisición, almacenamiento y distribución, facilitando el acceso a información relevante para la toma de decisiones.</w:t>
+      </w:r>
+    </w:p>
+    <w:p>
+      <w:r>
+        <w:t>Uno de los principales aportes de la solución será la incorporación de análisis predictivo para la estimación de la demanda. El uso de información histórica permitirá identificar patrones y tendencias que puedan utilizarse como apoyo para anticipar las necesidades futuras de productos. Esto puede contribuir a reducir el riesgo de desabastecimiento y evitar adquisiciones que generen niveles de inventario superiores a las necesidades previstas.</w:t>
+      </w:r>
+    </w:p>
+    <w:p>
+      <w:r>
+        <w:t>La optimización del almacenamiento permitirá apoyar la distribución de los productos dentro de los espacios disponibles, considerando variables relacionadas con la demanda y rotación de los productos. Esto busca facilitar las operaciones de almacenamiento y preparación de pedidos y contribuir a un mejor aprovechamiento del espacio.</w:t>
+      </w:r>
+    </w:p>
+    <w:p>
+      <w:r>
+        <w:t>Por otra parte, la optimización de rutas permitirá analizar alternativas de transporte para determinar recorridos eficientes de acuerdo con las condiciones consideradas por el sistema. Esto puede contribuir a reducir distancias y tiempos de desplazamiento durante los procesos de distribución.</w:t>
+      </w:r>
+    </w:p>
+    <w:p>
+      <w:r>
+        <w:t xml:space="preserve">El seguimiento de productos proporcionará visibilidad sobre el estado de los productos durante las diferentes etapas de la cadena de suministro. Complementariamente, la integración con dispositivos </w:t>
+      </w:r>
+      <w:proofErr w:type="spellStart"/>
+      <w:r>
+        <w:t>IoT</w:t>
+      </w:r>
+      <w:proofErr w:type="spellEnd"/>
+      <w:r>
+        <w:t xml:space="preserve"> </w:t>
       </w:r>
       <w:r>
         <w:lastRenderedPageBreak/>
@@ -2636,13 +2984,7 @@
     </w:p>
     <w:p>
       <w:r>
-        <w:t>Por lo tanto, el proyecto busca aportar valor mediante una solución que combine la gesti</w:t>
-      </w:r>
-      <w:r>
-        <w:t>ón operativa con capacidades de análisis, optimización y monitoreo. De esta manera, el sistema podrá servir como herramienta de apoyo para que las organizaciones puedan gestionar sus cadenas de suministro de una manera más eficiente y basada en información</w:t>
-      </w:r>
-      <w:r>
-        <w:t>.</w:t>
+        <w:t>Por lo tanto, el proyecto busca aportar valor mediante una solución que combine la gestión operativa con capacidades de análisis, optimización y monitoreo. De esta manera, el sistema podrá servir como herramienta de apoyo para que las organizaciones puedan gestionar sus cadenas de suministro de una manera más eficiente y basada en información.</w:t>
       </w:r>
     </w:p>
     <w:p>
@@ -2652,7 +2994,7 @@
       <w:r>
         <w:br w:type="page"/>
       </w:r>
-      <w:bookmarkStart w:id="7" w:name="_Toc237881523"/>
+      <w:bookmarkStart w:id="7" w:name="_Toc239179219"/>
       <w:r>
         <w:lastRenderedPageBreak/>
         <w:t>Objetivos</w:t>
@@ -2663,12 +3005,9 @@
       <w:pPr>
         <w:pStyle w:val="Ttulo2"/>
       </w:pPr>
-      <w:bookmarkStart w:id="8" w:name="_Toc237881524"/>
-      <w:r>
-        <w:t>O</w:t>
-      </w:r>
-      <w:r>
-        <w:t>bjetivo general</w:t>
+      <w:bookmarkStart w:id="8" w:name="_Toc239179220"/>
+      <w:r>
+        <w:t>Objetivo general</w:t>
       </w:r>
       <w:bookmarkEnd w:id="8"/>
     </w:p>
@@ -2681,7 +3020,7 @@
       <w:pPr>
         <w:pStyle w:val="Ttulo2"/>
       </w:pPr>
-      <w:bookmarkStart w:id="9" w:name="_Toc237881525"/>
+      <w:bookmarkStart w:id="9" w:name="_Toc239179221"/>
       <w:r>
         <w:t>Objetivos específicos</w:t>
       </w:r>
@@ -2696,10 +3035,7 @@
         </w:numPr>
       </w:pPr>
       <w:r>
-        <w:t xml:space="preserve">Implementar la gestión de proveedores, productos, inventarios, órdenes de </w:t>
-      </w:r>
-      <w:r>
-        <w:t>compra, pedidos, almacenes y despachos dentro de la cadena de suministro.</w:t>
+        <w:t>Implementar la gestión de proveedores, productos, inventarios, órdenes de compra, pedidos, almacenes y despachos dentro de la cadena de suministro.</w:t>
       </w:r>
     </w:p>
     <w:p>
@@ -2723,10 +3059,7 @@
         </w:numPr>
       </w:pPr>
       <w:r>
-        <w:t>Implementar un mecanism</w:t>
-      </w:r>
-      <w:r>
-        <w:t>o de análisis predictivo que permita estimar la demanda futura de productos utilizando información histórica.</w:t>
+        <w:t>Implementar un mecanismo de análisis predictivo que permita estimar la demanda futura de productos utilizando información histórica.</w:t>
       </w:r>
     </w:p>
     <w:p>
@@ -2738,10 +3071,7 @@
         </w:numPr>
       </w:pPr>
       <w:r>
-        <w:t>Optimizar la distribución de productos dentro de los espacios de almacenamiento considerando variables relacionadas con la demanda, rotación y dis</w:t>
-      </w:r>
-      <w:r>
-        <w:t>ponibilidad de espacio.</w:t>
+        <w:t>Optimizar la distribución de productos dentro de los espacios de almacenamiento considerando variables relacionadas con la demanda, rotación y disponibilidad de espacio.</w:t>
       </w:r>
     </w:p>
     <w:p>
@@ -2765,10 +3095,15 @@
         </w:numPr>
       </w:pPr>
       <w:r>
-        <w:t>Integrar dispositivos IoT que permitan obtener y visualizar información en tiempo real relacionada con el estado</w:t>
-      </w:r>
-      <w:r>
-        <w:t xml:space="preserve"> y ubicación de los productos durante su transporte.</w:t>
+        <w:t xml:space="preserve">Integrar dispositivos </w:t>
+      </w:r>
+      <w:proofErr w:type="spellStart"/>
+      <w:r>
+        <w:t>IoT</w:t>
+      </w:r>
+      <w:proofErr w:type="spellEnd"/>
+      <w:r>
+        <w:t xml:space="preserve"> que permitan obtener y visualizar información en tiempo real relacionada con el estado y ubicación de los productos durante su transporte.</w:t>
       </w:r>
     </w:p>
     <w:p>
@@ -2790,7 +3125,7 @@
       <w:r>
         <w:br w:type="page"/>
       </w:r>
-      <w:bookmarkStart w:id="10" w:name="_Toc237881526"/>
+      <w:bookmarkStart w:id="10" w:name="_Toc239179222"/>
       <w:r>
         <w:lastRenderedPageBreak/>
         <w:t>Alcance</w:t>
@@ -2801,12 +3136,9 @@
       <w:pPr>
         <w:pStyle w:val="Ttulo2"/>
       </w:pPr>
-      <w:bookmarkStart w:id="11" w:name="_Toc237881527"/>
-      <w:r>
-        <w:t>G</w:t>
-      </w:r>
-      <w:r>
-        <w:t>estión de proveedores</w:t>
+      <w:bookmarkStart w:id="11" w:name="_Toc239179223"/>
+      <w:r>
+        <w:t>Gestión de proveedores</w:t>
       </w:r>
       <w:bookmarkEnd w:id="11"/>
     </w:p>
@@ -2819,7 +3151,7 @@
       <w:pPr>
         <w:pStyle w:val="Ttulo2"/>
       </w:pPr>
-      <w:bookmarkStart w:id="12" w:name="_Toc237881528"/>
+      <w:bookmarkStart w:id="12" w:name="_Toc239179224"/>
       <w:r>
         <w:t>Gestión de productos</w:t>
       </w:r>
@@ -2827,17 +3159,14 @@
     </w:p>
     <w:p>
       <w:r>
-        <w:t>Permitirá administrar la información de los productos, incluyendo sus caracter</w:t>
-      </w:r>
-      <w:r>
-        <w:t>ísticas, categorías, disponibilidad y demás información necesaria para su gestión dentro de la cadena.</w:t>
+        <w:t>Permitirá administrar la información de los productos, incluyendo sus características, categorías, disponibilidad y demás información necesaria para su gestión dentro de la cadena.</w:t>
       </w:r>
     </w:p>
     <w:p>
       <w:pPr>
         <w:pStyle w:val="Ttulo2"/>
       </w:pPr>
-      <w:bookmarkStart w:id="13" w:name="_Toc237881529"/>
+      <w:bookmarkStart w:id="13" w:name="_Toc239179225"/>
       <w:r>
         <w:t>Gestión de abastecimiento</w:t>
       </w:r>
@@ -2845,17 +3174,14 @@
     </w:p>
     <w:p>
       <w:r>
-        <w:t>Permitirá registrar y gestionar las necesidades de abastecimiento y las órdenes de compra realizadas a los proveedores, así com</w:t>
-      </w:r>
-      <w:r>
-        <w:t>o controlar el proceso de recepción de los productos adquiridos.</w:t>
+        <w:t>Permitirá registrar y gestionar las necesidades de abastecimiento y las órdenes de compra realizadas a los proveedores, así como controlar el proceso de recepción de los productos adquiridos.</w:t>
       </w:r>
     </w:p>
     <w:p>
       <w:pPr>
         <w:pStyle w:val="Ttulo2"/>
       </w:pPr>
-      <w:bookmarkStart w:id="14" w:name="_Toc237881530"/>
+      <w:bookmarkStart w:id="14" w:name="_Toc239179226"/>
       <w:r>
         <w:t>Gestión de inventario</w:t>
       </w:r>
@@ -2863,17 +3189,14 @@
     </w:p>
     <w:p>
       <w:r>
-        <w:t xml:space="preserve">Permitirá controlar las entradas y salidas de productos, consultar los niveles actuales de inventario y generar información relacionada con la disponibilidad y rotación </w:t>
-      </w:r>
-      <w:r>
-        <w:t>de los productos.</w:t>
+        <w:t>Permitirá controlar las entradas y salidas de productos, consultar los niveles actuales de inventario y generar información relacionada con la disponibilidad y rotación de los productos.</w:t>
       </w:r>
     </w:p>
     <w:p>
       <w:pPr>
         <w:pStyle w:val="Ttulo2"/>
       </w:pPr>
-      <w:bookmarkStart w:id="15" w:name="_Toc237881531"/>
+      <w:bookmarkStart w:id="15" w:name="_Toc239179227"/>
       <w:r>
         <w:t>Seguimiento de productos</w:t>
       </w:r>
@@ -2888,7 +3211,7 @@
       <w:pPr>
         <w:pStyle w:val="Ttulo2"/>
       </w:pPr>
-      <w:bookmarkStart w:id="16" w:name="_Toc237881532"/>
+      <w:bookmarkStart w:id="16" w:name="_Toc239179228"/>
       <w:r>
         <w:t>Predicción de demanda</w:t>
       </w:r>
@@ -2896,23 +3219,17 @@
     </w:p>
     <w:p>
       <w:r>
-        <w:t>El sist</w:t>
-      </w:r>
-      <w:r>
-        <w:t>ema incorporará un mecanismo de análisis predictivo que utilizará datos históricos para estimar la demanda futura de los productos. Los resultados serán utilizados como información de apoyo para la planificación del abastecimiento.</w:t>
+        <w:t>El sistema incorporará un mecanismo de análisis predictivo que utilizará datos históricos para estimar la demanda futura de los productos. Los resultados serán utilizados como información de apoyo para la planificación del abastecimiento.</w:t>
       </w:r>
     </w:p>
     <w:p>
       <w:pPr>
         <w:pStyle w:val="Ttulo2"/>
       </w:pPr>
-      <w:bookmarkStart w:id="17" w:name="_Toc237881533"/>
+      <w:bookmarkStart w:id="17" w:name="_Toc239179229"/>
       <w:r>
         <w:lastRenderedPageBreak/>
-        <w:t>Optimización del almacen</w:t>
-      </w:r>
-      <w:r>
-        <w:t>amiento</w:t>
+        <w:t>Optimización del almacenamiento</w:t>
       </w:r>
       <w:bookmarkEnd w:id="17"/>
     </w:p>
@@ -2925,7 +3242,7 @@
       <w:pPr>
         <w:pStyle w:val="Ttulo2"/>
       </w:pPr>
-      <w:bookmarkStart w:id="18" w:name="_Toc237881534"/>
+      <w:bookmarkStart w:id="18" w:name="_Toc239179230"/>
       <w:r>
         <w:t>Gestión de pedidos y despachos</w:t>
       </w:r>
@@ -2933,17 +3250,14 @@
     </w:p>
     <w:p>
       <w:r>
-        <w:t>Permitirá registr</w:t>
-      </w:r>
-      <w:r>
-        <w:t>ar y gestionar pedidos, controlar su preparación y administrar los estados asociados al proceso de despacho y entrega.</w:t>
+        <w:t>Permitirá registrar y gestionar pedidos, controlar su preparación y administrar los estados asociados al proceso de despacho y entrega.</w:t>
       </w:r>
     </w:p>
     <w:p>
       <w:pPr>
         <w:pStyle w:val="Ttulo2"/>
       </w:pPr>
-      <w:bookmarkStart w:id="19" w:name="_Toc237881535"/>
+      <w:bookmarkStart w:id="19" w:name="_Toc239179231"/>
       <w:r>
         <w:t>Optimización de rutas</w:t>
       </w:r>
@@ -2951,35 +3265,42 @@
     </w:p>
     <w:p>
       <w:r>
-        <w:t>El sistema permitirá analizar diferentes alternativas de rutas de transporte y determinar recorridos eficientes par</w:t>
-      </w:r>
-      <w:r>
-        <w:t>a la distribución de los productos, considerando los criterios definidos para el sistema.</w:t>
+        <w:t>El sistema permitirá analizar diferentes alternativas de rutas de transporte y determinar recorridos eficientes para la distribución de los productos, considerando los criterios definidos para el sistema.</w:t>
       </w:r>
     </w:p>
     <w:p>
       <w:pPr>
         <w:pStyle w:val="Ttulo2"/>
       </w:pPr>
-      <w:bookmarkStart w:id="20" w:name="_Toc237881536"/>
-      <w:r>
-        <w:t>Integración con IoT</w:t>
+      <w:bookmarkStart w:id="20" w:name="_Toc239179232"/>
+      <w:r>
+        <w:t xml:space="preserve">Integración con </w:t>
+      </w:r>
+      <w:proofErr w:type="spellStart"/>
+      <w:r>
+        <w:t>IoT</w:t>
       </w:r>
       <w:bookmarkEnd w:id="20"/>
-    </w:p>
-    <w:p>
-      <w:r>
-        <w:t>Se incorporará una integración con dispositivos IoT para recibir información en tiempo real relacionada con el seguimiento y monitoreo de los prod</w:t>
-      </w:r>
-      <w:r>
-        <w:t>uctos durante su transporte.</w:t>
+      <w:proofErr w:type="spellEnd"/>
+    </w:p>
+    <w:p>
+      <w:r>
+        <w:t xml:space="preserve">Se incorporará una integración con dispositivos </w:t>
+      </w:r>
+      <w:proofErr w:type="spellStart"/>
+      <w:r>
+        <w:t>IoT</w:t>
+      </w:r>
+      <w:proofErr w:type="spellEnd"/>
+      <w:r>
+        <w:t xml:space="preserve"> para recibir información en tiempo real relacionada con el seguimiento y monitoreo de los productos durante su transporte.</w:t>
       </w:r>
     </w:p>
     <w:p>
       <w:pPr>
         <w:pStyle w:val="Ttulo2"/>
       </w:pPr>
-      <w:bookmarkStart w:id="21" w:name="_Toc237881537"/>
+      <w:bookmarkStart w:id="21" w:name="_Toc239179233"/>
       <w:r>
         <w:t>Panel de información</w:t>
       </w:r>
@@ -2997,7 +3318,7 @@
       <w:r>
         <w:br w:type="page"/>
       </w:r>
-      <w:bookmarkStart w:id="22" w:name="_Toc237881538"/>
+      <w:bookmarkStart w:id="22" w:name="_Toc239179234"/>
       <w:r>
         <w:lastRenderedPageBreak/>
         <w:t>L</w:t>
@@ -3009,10 +3330,7 @@
     </w:p>
     <w:p>
       <w:r>
-        <w:t>C</w:t>
-      </w:r>
-      <w:r>
-        <w:t>on el propósito de mantener el proyecto dentro de un alcance viable, no se contemplarán:</w:t>
+        <w:t>Con el propósito de mantener el proyecto dentro de un alcance viable, no se contemplarán:</w:t>
       </w:r>
     </w:p>
     <w:p>
@@ -3048,10 +3366,7 @@
         </w:numPr>
       </w:pPr>
       <w:r>
-        <w:t>Contabilidad financi</w:t>
-      </w:r>
-      <w:r>
-        <w:t>era y contabilidad avanzada.</w:t>
+        <w:t>Contabilidad financiera y contabilidad avanzada.</w:t>
       </w:r>
     </w:p>
     <w:p>
@@ -3135,10 +3450,7 @@
         </w:numPr>
       </w:pPr>
       <w:r>
-        <w:t>Integración ob</w:t>
-      </w:r>
-      <w:r>
-        <w:t>ligatoria con los sistemas internos de proveedores externos.</w:t>
+        <w:t>Integración obligatoria con los sistemas internos de proveedores externos.</w:t>
       </w:r>
     </w:p>
     <w:p>
@@ -3186,10 +3498,15 @@
         </w:numPr>
       </w:pPr>
       <w:r>
-        <w:t>Implementación de infraestructura Io</w:t>
-      </w:r>
-      <w:r>
-        <w:t>T de escala industrial.</w:t>
+        <w:t xml:space="preserve">Implementación de infraestructura </w:t>
+      </w:r>
+      <w:proofErr w:type="spellStart"/>
+      <w:r>
+        <w:t>IoT</w:t>
+      </w:r>
+      <w:proofErr w:type="spellEnd"/>
+      <w:r>
+        <w:t xml:space="preserve"> de escala industrial.</w:t>
       </w:r>
     </w:p>
     <w:p>
@@ -3199,11 +3516,965 @@
     </w:p>
     <w:p>
       <w:pPr>
-        <w:pStyle w:val="Prrafodelista"/>
-      </w:pPr>
-    </w:p>
+        <w:spacing w:after="0" w:line="240" w:lineRule="auto"/>
+        <w:jc w:val="left"/>
+      </w:pPr>
+      <w:r>
+        <w:br w:type="page"/>
+      </w:r>
+    </w:p>
+    <w:p>
+      <w:pPr>
+        <w:pStyle w:val="Ttulo1"/>
+      </w:pPr>
+      <w:bookmarkStart w:id="23" w:name="_Toc239179235"/>
+      <w:r>
+        <w:lastRenderedPageBreak/>
+        <w:t>Desarrollo del Sistema</w:t>
+      </w:r>
+      <w:bookmarkEnd w:id="23"/>
+    </w:p>
+    <w:p>
+      <w:pPr>
+        <w:pStyle w:val="Ttulo2"/>
+      </w:pPr>
+      <w:bookmarkStart w:id="24" w:name="_Toc239179236"/>
+      <w:r>
+        <w:t>Aplicación del Patrón Singleton</w:t>
+      </w:r>
+      <w:bookmarkEnd w:id="24"/>
+    </w:p>
+    <w:p>
+      <w:pPr>
+        <w:pStyle w:val="Ttulo3"/>
+      </w:pPr>
+      <w:bookmarkStart w:id="25" w:name="_Toc239179237"/>
+      <w:r>
+        <w:t>Evidencia</w:t>
+      </w:r>
+      <w:r>
+        <w:t>s</w:t>
+      </w:r>
+      <w:r>
+        <w:t xml:space="preserve"> de Uso</w:t>
+      </w:r>
+      <w:bookmarkEnd w:id="25"/>
+    </w:p>
+    <w:p>
+      <w:r>
+        <w:rPr>
+          <w:noProof/>
+        </w:rPr>
+        <w:drawing>
+          <wp:inline distT="0" distB="0" distL="0" distR="0" wp14:anchorId="47FBE2A2" wp14:editId="4CCE7D5F">
+            <wp:extent cx="5943600" cy="1791970"/>
+            <wp:effectExtent l="0" t="0" r="0" b="0"/>
+            <wp:docPr id="3" name="Imagen 3"/>
+            <wp:cNvGraphicFramePr>
+              <a:graphicFrameLocks xmlns:a="http://schemas.openxmlformats.org/drawingml/2006/main" noChangeAspect="1"/>
+            </wp:cNvGraphicFramePr>
+            <a:graphic xmlns:a="http://schemas.openxmlformats.org/drawingml/2006/main">
+              <a:graphicData uri="http://schemas.openxmlformats.org/drawingml/2006/picture">
+                <pic:pic xmlns:pic="http://schemas.openxmlformats.org/drawingml/2006/picture">
+                  <pic:nvPicPr>
+                    <pic:cNvPr id="1" name=""/>
+                    <pic:cNvPicPr/>
+                  </pic:nvPicPr>
+                  <pic:blipFill>
+                    <a:blip r:embed="rId8"/>
+                    <a:stretch>
+                      <a:fillRect/>
+                    </a:stretch>
+                  </pic:blipFill>
+                  <pic:spPr>
+                    <a:xfrm>
+                      <a:off x="0" y="0"/>
+                      <a:ext cx="5943600" cy="1791970"/>
+                    </a:xfrm>
+                    <a:prstGeom prst="rect">
+                      <a:avLst/>
+                    </a:prstGeom>
+                  </pic:spPr>
+                </pic:pic>
+              </a:graphicData>
+            </a:graphic>
+          </wp:inline>
+        </w:drawing>
+      </w:r>
+    </w:p>
+    <w:p>
+      <w:r>
+        <w:rPr>
+          <w:noProof/>
+        </w:rPr>
+        <w:drawing>
+          <wp:inline distT="0" distB="0" distL="0" distR="0" wp14:anchorId="7B191849" wp14:editId="486E0DED">
+            <wp:extent cx="5943600" cy="2027555"/>
+            <wp:effectExtent l="0" t="0" r="0" b="0"/>
+            <wp:docPr id="4" name="Imagen 4"/>
+            <wp:cNvGraphicFramePr>
+              <a:graphicFrameLocks xmlns:a="http://schemas.openxmlformats.org/drawingml/2006/main" noChangeAspect="1"/>
+            </wp:cNvGraphicFramePr>
+            <a:graphic xmlns:a="http://schemas.openxmlformats.org/drawingml/2006/main">
+              <a:graphicData uri="http://schemas.openxmlformats.org/drawingml/2006/picture">
+                <pic:pic xmlns:pic="http://schemas.openxmlformats.org/drawingml/2006/picture">
+                  <pic:nvPicPr>
+                    <pic:cNvPr id="1" name=""/>
+                    <pic:cNvPicPr/>
+                  </pic:nvPicPr>
+                  <pic:blipFill>
+                    <a:blip r:embed="rId9"/>
+                    <a:stretch>
+                      <a:fillRect/>
+                    </a:stretch>
+                  </pic:blipFill>
+                  <pic:spPr>
+                    <a:xfrm>
+                      <a:off x="0" y="0"/>
+                      <a:ext cx="5943600" cy="2027555"/>
+                    </a:xfrm>
+                    <a:prstGeom prst="rect">
+                      <a:avLst/>
+                    </a:prstGeom>
+                  </pic:spPr>
+                </pic:pic>
+              </a:graphicData>
+            </a:graphic>
+          </wp:inline>
+        </w:drawing>
+      </w:r>
+    </w:p>
+    <w:p>
+      <w:r>
+        <w:rPr>
+          <w:noProof/>
+        </w:rPr>
+        <w:lastRenderedPageBreak/>
+        <w:drawing>
+          <wp:inline distT="0" distB="0" distL="0" distR="0" wp14:anchorId="667BBF95" wp14:editId="7E5F0459">
+            <wp:extent cx="5943600" cy="2758440"/>
+            <wp:effectExtent l="0" t="0" r="0" b="3810"/>
+            <wp:docPr id="5" name="Imagen 5"/>
+            <wp:cNvGraphicFramePr>
+              <a:graphicFrameLocks xmlns:a="http://schemas.openxmlformats.org/drawingml/2006/main" noChangeAspect="1"/>
+            </wp:cNvGraphicFramePr>
+            <a:graphic xmlns:a="http://schemas.openxmlformats.org/drawingml/2006/main">
+              <a:graphicData uri="http://schemas.openxmlformats.org/drawingml/2006/picture">
+                <pic:pic xmlns:pic="http://schemas.openxmlformats.org/drawingml/2006/picture">
+                  <pic:nvPicPr>
+                    <pic:cNvPr id="1" name=""/>
+                    <pic:cNvPicPr/>
+                  </pic:nvPicPr>
+                  <pic:blipFill>
+                    <a:blip r:embed="rId10"/>
+                    <a:stretch>
+                      <a:fillRect/>
+                    </a:stretch>
+                  </pic:blipFill>
+                  <pic:spPr>
+                    <a:xfrm>
+                      <a:off x="0" y="0"/>
+                      <a:ext cx="5943600" cy="2758440"/>
+                    </a:xfrm>
+                    <a:prstGeom prst="rect">
+                      <a:avLst/>
+                    </a:prstGeom>
+                  </pic:spPr>
+                </pic:pic>
+              </a:graphicData>
+            </a:graphic>
+          </wp:inline>
+        </w:drawing>
+      </w:r>
+    </w:p>
+    <w:p>
+      <w:pPr>
+        <w:pStyle w:val="Ttulo3"/>
+      </w:pPr>
+      <w:bookmarkStart w:id="26" w:name="_Toc239179238"/>
+      <w:r>
+        <w:t>Como Está Colaborando Este Patrón al Proyecto</w:t>
+      </w:r>
+      <w:bookmarkEnd w:id="26"/>
+    </w:p>
+    <w:p>
+      <w:r>
+        <w:t xml:space="preserve">Para entender como este patrón </w:t>
+      </w:r>
+      <w:r>
+        <w:t>está</w:t>
+      </w:r>
+      <w:r>
+        <w:t xml:space="preserve"> colaborando con nuestro proyecto</w:t>
+      </w:r>
+      <w:r>
+        <w:t>,</w:t>
+      </w:r>
+      <w:r>
+        <w:t xml:space="preserve"> </w:t>
+      </w:r>
+      <w:r>
+        <w:t>primeramente,</w:t>
+      </w:r>
+      <w:r>
+        <w:t xml:space="preserve"> hay que irnos a los conceptos fundamentales del </w:t>
+      </w:r>
+      <w:proofErr w:type="spellStart"/>
+      <w:r>
+        <w:t>framework</w:t>
+      </w:r>
+      <w:proofErr w:type="spellEnd"/>
+      <w:r>
+        <w:t xml:space="preserve"> que estamos utilizando. El </w:t>
+      </w:r>
+      <w:proofErr w:type="spellStart"/>
+      <w:r>
+        <w:t>framework</w:t>
+      </w:r>
+      <w:proofErr w:type="spellEnd"/>
+      <w:r>
+        <w:t xml:space="preserve"> que nosotros estamos usando para este proyecto, es </w:t>
+      </w:r>
+      <w:r>
+        <w:rPr>
+          <w:b/>
+          <w:bCs/>
+        </w:rPr>
+        <w:t>Spring Framework</w:t>
+      </w:r>
+      <w:r>
+        <w:t xml:space="preserve">, es un </w:t>
+      </w:r>
+      <w:proofErr w:type="spellStart"/>
+      <w:r>
+        <w:t>framework</w:t>
+      </w:r>
+      <w:proofErr w:type="spellEnd"/>
+      <w:r>
+        <w:t xml:space="preserve"> de Java que en conjunto con </w:t>
+      </w:r>
+      <w:r>
+        <w:t xml:space="preserve">la herramienta </w:t>
+      </w:r>
+      <w:r>
+        <w:rPr>
+          <w:b/>
+          <w:bCs/>
+        </w:rPr>
+        <w:t xml:space="preserve">Spring </w:t>
+      </w:r>
+      <w:proofErr w:type="spellStart"/>
+      <w:r>
+        <w:rPr>
+          <w:b/>
+          <w:bCs/>
+        </w:rPr>
+        <w:t>Boot</w:t>
+      </w:r>
+      <w:proofErr w:type="spellEnd"/>
+      <w:r>
+        <w:rPr>
+          <w:b/>
+          <w:bCs/>
+        </w:rPr>
+        <w:t xml:space="preserve"> </w:t>
+      </w:r>
+      <w:r>
+        <w:t xml:space="preserve">ayudan a crear muchos tipos diferentes de sistemas de una manera sencilla. </w:t>
+      </w:r>
+      <w:r>
+        <w:rPr>
+          <w:b/>
+          <w:bCs/>
+        </w:rPr>
+        <w:t>Spring</w:t>
+      </w:r>
+      <w:r>
+        <w:t xml:space="preserve">, internamente maneja </w:t>
+      </w:r>
+      <w:proofErr w:type="spellStart"/>
+      <w:r>
+        <w:rPr>
+          <w:b/>
+          <w:bCs/>
+        </w:rPr>
+        <w:t>Beans</w:t>
+      </w:r>
+      <w:proofErr w:type="spellEnd"/>
+      <w:r>
+        <w:t xml:space="preserve">, los cuales son objetos que son instanciados, configurados y gestionados por un contenedor llamado </w:t>
+      </w:r>
+      <w:r>
+        <w:rPr>
+          <w:b/>
+          <w:bCs/>
+        </w:rPr>
+        <w:t>Inversión de Control (</w:t>
+      </w:r>
+      <w:proofErr w:type="spellStart"/>
+      <w:r>
+        <w:rPr>
+          <w:b/>
+          <w:bCs/>
+        </w:rPr>
+        <w:t>IoC</w:t>
+      </w:r>
+      <w:proofErr w:type="spellEnd"/>
+      <w:r>
+        <w:rPr>
+          <w:b/>
+          <w:bCs/>
+        </w:rPr>
+        <w:t>)</w:t>
+      </w:r>
+      <w:r>
+        <w:t xml:space="preserve">. Estos </w:t>
+      </w:r>
+      <w:proofErr w:type="spellStart"/>
+      <w:r>
+        <w:rPr>
+          <w:b/>
+          <w:bCs/>
+        </w:rPr>
+        <w:t>Beans</w:t>
+      </w:r>
+      <w:proofErr w:type="spellEnd"/>
+      <w:r>
+        <w:rPr>
+          <w:b/>
+          <w:bCs/>
+        </w:rPr>
+        <w:t xml:space="preserve"> </w:t>
+      </w:r>
+      <w:r>
+        <w:t xml:space="preserve">pueden estar divididos en diferentes tipos según el uso que se le vaya a dar, para este caso, tenemos los </w:t>
+      </w:r>
+      <w:r>
+        <w:rPr>
+          <w:b/>
+          <w:bCs/>
+        </w:rPr>
+        <w:t>@RestControllers, @Services</w:t>
+      </w:r>
+      <w:r>
+        <w:t xml:space="preserve"> y </w:t>
+      </w:r>
+      <w:r>
+        <w:rPr>
+          <w:b/>
+          <w:bCs/>
+        </w:rPr>
+        <w:t>@Component</w:t>
+      </w:r>
+      <w:r>
+        <w:t xml:space="preserve">. El contenedor </w:t>
+      </w:r>
+      <w:proofErr w:type="spellStart"/>
+      <w:r>
+        <w:rPr>
+          <w:b/>
+          <w:bCs/>
+        </w:rPr>
+        <w:t>IoC</w:t>
+      </w:r>
+      <w:proofErr w:type="spellEnd"/>
+      <w:r>
+        <w:t xml:space="preserve"> internamente </w:t>
+      </w:r>
+      <w:r>
+        <w:rPr>
+          <w:b/>
+          <w:bCs/>
+        </w:rPr>
+        <w:t>aplica el patr</w:t>
+      </w:r>
+      <w:r>
+        <w:rPr>
+          <w:b/>
+          <w:bCs/>
+        </w:rPr>
+        <w:t xml:space="preserve">ón </w:t>
+      </w:r>
+      <w:proofErr w:type="spellStart"/>
+      <w:r>
+        <w:rPr>
+          <w:b/>
+          <w:bCs/>
+        </w:rPr>
+        <w:t>singleton</w:t>
+      </w:r>
+      <w:proofErr w:type="spellEnd"/>
+      <w:r>
+        <w:t xml:space="preserve"> para dar una </w:t>
+      </w:r>
+      <w:r>
+        <w:rPr>
+          <w:b/>
+          <w:bCs/>
+        </w:rPr>
+        <w:t>mayor eficiencia de memoria</w:t>
+      </w:r>
+      <w:r>
+        <w:t xml:space="preserve"> haciendo que para cada </w:t>
+      </w:r>
+      <w:proofErr w:type="spellStart"/>
+      <w:r>
+        <w:rPr>
+          <w:b/>
+          <w:bCs/>
+        </w:rPr>
+        <w:t>Bean</w:t>
+      </w:r>
+      <w:proofErr w:type="spellEnd"/>
+      <w:r>
+        <w:t xml:space="preserve"> que se vaya a instanciar y gestionar, se maneje una </w:t>
+      </w:r>
+      <w:r>
+        <w:rPr>
+          <w:b/>
+          <w:bCs/>
+        </w:rPr>
+        <w:t>única instancia compartida</w:t>
+      </w:r>
+      <w:r>
+        <w:t xml:space="preserve"> y que también por medio de ello se pueda aplicar el patrón de diseño de </w:t>
+      </w:r>
+      <w:r>
+        <w:rPr>
+          <w:b/>
+          <w:bCs/>
+        </w:rPr>
+        <w:t>inyección de dependencias.</w:t>
+      </w:r>
+    </w:p>
+    <w:p>
+      <w:r>
+        <w:t xml:space="preserve">Aplicar este patrón aquí es muy importante ya que como dijimos anteriormente, permite tener una mayor eficiencia de memoria, aplicar principios como la inyección de dependencias (lo cual es muy importante en Spring) y otras cosas como tener una mayor velocidad de respuesta y que el </w:t>
+      </w:r>
+      <w:proofErr w:type="spellStart"/>
+      <w:r>
+        <w:rPr>
+          <w:b/>
+          <w:bCs/>
+        </w:rPr>
+        <w:t>Garbage</w:t>
+      </w:r>
+      <w:proofErr w:type="spellEnd"/>
+      <w:r>
+        <w:rPr>
+          <w:b/>
+          <w:bCs/>
+        </w:rPr>
+        <w:t xml:space="preserve"> </w:t>
+      </w:r>
+      <w:proofErr w:type="spellStart"/>
+      <w:r>
+        <w:rPr>
+          <w:b/>
+          <w:bCs/>
+        </w:rPr>
+        <w:t>Collection</w:t>
+      </w:r>
+      <w:proofErr w:type="spellEnd"/>
+      <w:r>
+        <w:rPr>
+          <w:b/>
+          <w:bCs/>
+        </w:rPr>
+        <w:t xml:space="preserve"> </w:t>
+      </w:r>
+      <w:r>
+        <w:t xml:space="preserve">de Java trabaje de una manera mucho </w:t>
+      </w:r>
+      <w:r>
+        <w:t>más</w:t>
+      </w:r>
+      <w:r>
+        <w:t xml:space="preserve"> eficiente mejorando el rendimiento global.</w:t>
+      </w:r>
+    </w:p>
+    <w:p>
+      <w:pPr>
+        <w:pStyle w:val="Ttulo3"/>
+      </w:pPr>
+      <w:bookmarkStart w:id="27" w:name="_Toc239179239"/>
+      <w:r>
+        <w:lastRenderedPageBreak/>
+        <w:t xml:space="preserve">Explicación y </w:t>
+      </w:r>
+      <w:r>
+        <w:t>Prueba de que Funciona</w:t>
+      </w:r>
+      <w:bookmarkEnd w:id="27"/>
+    </w:p>
+    <w:p>
+      <w:r>
+        <w:t xml:space="preserve">Bueno, </w:t>
+      </w:r>
+      <w:r>
+        <w:t>primeramente,</w:t>
+      </w:r>
+      <w:r>
+        <w:t xml:space="preserve"> daremos una breve explicación de que hace cada parte de la evidencia que adjuntamos en el apartado </w:t>
+      </w:r>
+      <w:r>
+        <w:rPr>
+          <w:b/>
+          <w:bCs/>
+        </w:rPr>
+        <w:t>8.1.1</w:t>
+      </w:r>
+      <w:r>
+        <w:rPr>
+          <w:b/>
+          <w:bCs/>
+        </w:rPr>
+        <w:t xml:space="preserve">. </w:t>
+      </w:r>
+      <w:r>
+        <w:t xml:space="preserve">Es importante resaltar que esta evidencia adjunta </w:t>
+      </w:r>
+      <w:r>
+        <w:t>está</w:t>
+      </w:r>
+      <w:r>
+        <w:t xml:space="preserve"> ubicada en la funcionalidad de </w:t>
+      </w:r>
+      <w:r>
+        <w:rPr>
+          <w:b/>
+          <w:bCs/>
+        </w:rPr>
+        <w:t>creación de proveedores</w:t>
+      </w:r>
+      <w:r>
+        <w:t xml:space="preserve"> en el </w:t>
+      </w:r>
+      <w:proofErr w:type="spellStart"/>
+      <w:r>
+        <w:rPr>
+          <w:b/>
+          <w:bCs/>
+        </w:rPr>
+        <w:t>backend</w:t>
+      </w:r>
+      <w:proofErr w:type="spellEnd"/>
+      <w:r>
+        <w:t xml:space="preserve">. Sin embargo, este patrón </w:t>
+      </w:r>
+      <w:r>
+        <w:t>está</w:t>
+      </w:r>
+      <w:r>
+        <w:t xml:space="preserve"> siendo utilizado en muchas otras partes también. Las evidencias que adjuntamos solo son una parte de todo lo que es esta funcionalidad, pero es, por así decirlo, el núcleo para que funcione.</w:t>
+      </w:r>
+    </w:p>
+    <w:p>
+      <w:pPr>
+        <w:pStyle w:val="Ttulo4"/>
+        <w:rPr>
+          <w:lang w:val="en-US"/>
+        </w:rPr>
+      </w:pPr>
+      <w:r>
+        <w:rPr>
+          <w:lang w:val="en-US"/>
+        </w:rPr>
+        <w:t xml:space="preserve">@RestController </w:t>
+      </w:r>
+      <w:proofErr w:type="spellStart"/>
+      <w:r>
+        <w:rPr>
+          <w:lang w:val="en-US"/>
+        </w:rPr>
+        <w:t>SupplierController</w:t>
+      </w:r>
+      <w:proofErr w:type="spellEnd"/>
+    </w:p>
+    <w:p>
+      <w:r>
+        <w:t xml:space="preserve">Este componente es el </w:t>
+      </w:r>
+      <w:r>
+        <w:t xml:space="preserve">encargado de recibir la petición del usuario por medio del </w:t>
+      </w:r>
+      <w:proofErr w:type="spellStart"/>
+      <w:r>
+        <w:t>endpoint</w:t>
+      </w:r>
+      <w:proofErr w:type="spellEnd"/>
+      <w:r>
+        <w:t xml:space="preserve"> </w:t>
+      </w:r>
+      <w:r>
+        <w:rPr>
+          <w:b/>
+          <w:bCs/>
+        </w:rPr>
+        <w:t>“/api/</w:t>
+      </w:r>
+      <w:proofErr w:type="spellStart"/>
+      <w:r>
+        <w:rPr>
+          <w:b/>
+          <w:bCs/>
+        </w:rPr>
+        <w:t>supplier</w:t>
+      </w:r>
+      <w:proofErr w:type="spellEnd"/>
+      <w:r>
+        <w:rPr>
+          <w:b/>
+          <w:bCs/>
+        </w:rPr>
+        <w:t>”</w:t>
+      </w:r>
+      <w:r>
+        <w:rPr>
+          <w:b/>
+          <w:bCs/>
+        </w:rPr>
+        <w:t xml:space="preserve"> </w:t>
+      </w:r>
+      <w:r>
+        <w:t xml:space="preserve">y dirigir la información al </w:t>
+      </w:r>
+      <w:r>
+        <w:rPr>
+          <w:b/>
+          <w:bCs/>
+        </w:rPr>
+        <w:t>@Service</w:t>
+      </w:r>
+      <w:r>
+        <w:rPr>
+          <w:b/>
+          <w:bCs/>
+        </w:rPr>
+        <w:t xml:space="preserve"> </w:t>
+      </w:r>
+      <w:r>
+        <w:t>que se encargara de orquestar el flujo de creación del proveedor. Asimismo, él se encarga también de devolverle la correspondiente respuesta al usuario cuando el proveedor haya sido creado.</w:t>
+      </w:r>
+    </w:p>
+    <w:p>
+      <w:pPr>
+        <w:pStyle w:val="Ttulo4"/>
+        <w:rPr>
+          <w:lang w:val="en-US"/>
+        </w:rPr>
+      </w:pPr>
+      <w:r>
+        <w:rPr>
+          <w:lang w:val="en-US"/>
+        </w:rPr>
+        <w:t xml:space="preserve">@Service </w:t>
+      </w:r>
+      <w:proofErr w:type="spellStart"/>
+      <w:r>
+        <w:rPr>
+          <w:lang w:val="en-US"/>
+        </w:rPr>
+        <w:t>SupplierService</w:t>
+      </w:r>
+      <w:proofErr w:type="spellEnd"/>
+    </w:p>
+    <w:p>
+      <w:pPr>
+        <w:rPr>
+          <w:b/>
+          <w:bCs/>
+        </w:rPr>
+      </w:pPr>
+      <w:r>
+        <w:t xml:space="preserve">Aquí se maneja la </w:t>
+      </w:r>
+      <w:r>
+        <w:t xml:space="preserve">orquestación del flujo de creación del proveedor, donde se capturan los datos que llegan, se hacen su correspondiente mapeo a entidad de dominio (estamos usando arquitectura hexagonal) y posteriormente se le pasa al </w:t>
+      </w:r>
+      <w:r>
+        <w:rPr>
+          <w:b/>
+          <w:bCs/>
+        </w:rPr>
+        <w:t xml:space="preserve">@Component </w:t>
+      </w:r>
+      <w:r>
+        <w:t xml:space="preserve">encargado de manejar la persistencia en la base de datos. Asimismo, cuando se obtiene una respuesta, se la envía al </w:t>
+      </w:r>
+      <w:r>
+        <w:rPr>
+          <w:b/>
+          <w:bCs/>
+        </w:rPr>
+        <w:t>@RestController</w:t>
+      </w:r>
+    </w:p>
+    <w:p>
+      <w:pPr>
+        <w:pStyle w:val="Ttulo4"/>
+      </w:pPr>
+      <w:r>
+        <w:t xml:space="preserve">@Component </w:t>
+      </w:r>
+      <w:proofErr w:type="spellStart"/>
+      <w:r>
+        <w:t>SupplierAdapterPersistence</w:t>
+      </w:r>
+      <w:proofErr w:type="spellEnd"/>
+    </w:p>
+    <w:p>
+      <w:r>
+        <w:t xml:space="preserve">En este apartado se maneja lo que es la comunicación con el componente interno que se encarga de recibir los datos para persistirlos definitivamente en la base de datos mediante </w:t>
+      </w:r>
+      <w:r>
+        <w:rPr>
+          <w:b/>
+          <w:bCs/>
+        </w:rPr>
+        <w:t xml:space="preserve">JPA e </w:t>
+      </w:r>
+      <w:proofErr w:type="spellStart"/>
+      <w:r>
+        <w:rPr>
+          <w:b/>
+          <w:bCs/>
+        </w:rPr>
+        <w:t>Hibernate</w:t>
+      </w:r>
+      <w:proofErr w:type="spellEnd"/>
+      <w:r>
+        <w:rPr>
+          <w:b/>
+          <w:bCs/>
+        </w:rPr>
+        <w:t xml:space="preserve">. </w:t>
+      </w:r>
+      <w:r>
+        <w:t xml:space="preserve">Primeramente, se reciben los datos que llegan del </w:t>
+      </w:r>
+      <w:r>
+        <w:rPr>
+          <w:b/>
+          <w:bCs/>
+        </w:rPr>
+        <w:t xml:space="preserve">@Service </w:t>
+      </w:r>
+      <w:r>
+        <w:t xml:space="preserve">y se envían al repositorio para guardarlos, después de ello, se envía la respuesta obtenida al </w:t>
+      </w:r>
+      <w:r>
+        <w:rPr>
+          <w:b/>
+          <w:bCs/>
+        </w:rPr>
+        <w:t xml:space="preserve">@Service </w:t>
+      </w:r>
+      <w:r>
+        <w:t>nuevamente.</w:t>
+      </w:r>
+    </w:p>
+    <w:p>
+      <w:pPr>
+        <w:pStyle w:val="Ttulo4"/>
+      </w:pPr>
+      <w:r>
+        <w:t>Funcionamiento</w:t>
+      </w:r>
+    </w:p>
+    <w:p>
+      <w:r>
+        <w:t xml:space="preserve">Ahora sí, para la prueba de funcionamiento, ya que todavía no contamos con una interfaz gráfica en el </w:t>
+      </w:r>
+      <w:proofErr w:type="spellStart"/>
+      <w:r>
+        <w:rPr>
+          <w:b/>
+          <w:bCs/>
+        </w:rPr>
+        <w:t>frontend</w:t>
+      </w:r>
+      <w:proofErr w:type="spellEnd"/>
+      <w:r>
+        <w:t xml:space="preserve">, utilizamos la herramienta </w:t>
+      </w:r>
+      <w:proofErr w:type="spellStart"/>
+      <w:r>
+        <w:rPr>
+          <w:b/>
+          <w:bCs/>
+        </w:rPr>
+        <w:t>Postman</w:t>
+      </w:r>
+      <w:proofErr w:type="spellEnd"/>
+      <w:r>
+        <w:t xml:space="preserve">, en la cual mandamos la siguiente petición a la </w:t>
+      </w:r>
+      <w:r>
+        <w:rPr>
+          <w:b/>
+          <w:bCs/>
+        </w:rPr>
+        <w:t>API.</w:t>
+      </w:r>
+    </w:p>
+    <w:p>
+      <w:r>
+        <w:rPr>
+          <w:noProof/>
+        </w:rPr>
+        <w:lastRenderedPageBreak/>
+        <w:drawing>
+          <wp:inline distT="0" distB="0" distL="0" distR="0" wp14:anchorId="6BCB94B5" wp14:editId="31381EAD">
+            <wp:extent cx="5943600" cy="2371090"/>
+            <wp:effectExtent l="0" t="0" r="0" b="0"/>
+            <wp:docPr id="6" name="Imagen 6"/>
+            <wp:cNvGraphicFramePr>
+              <a:graphicFrameLocks xmlns:a="http://schemas.openxmlformats.org/drawingml/2006/main" noChangeAspect="1"/>
+            </wp:cNvGraphicFramePr>
+            <a:graphic xmlns:a="http://schemas.openxmlformats.org/drawingml/2006/main">
+              <a:graphicData uri="http://schemas.openxmlformats.org/drawingml/2006/picture">
+                <pic:pic xmlns:pic="http://schemas.openxmlformats.org/drawingml/2006/picture">
+                  <pic:nvPicPr>
+                    <pic:cNvPr id="1" name=""/>
+                    <pic:cNvPicPr/>
+                  </pic:nvPicPr>
+                  <pic:blipFill>
+                    <a:blip r:embed="rId11"/>
+                    <a:stretch>
+                      <a:fillRect/>
+                    </a:stretch>
+                  </pic:blipFill>
+                  <pic:spPr>
+                    <a:xfrm>
+                      <a:off x="0" y="0"/>
+                      <a:ext cx="5943600" cy="2371090"/>
+                    </a:xfrm>
+                    <a:prstGeom prst="rect">
+                      <a:avLst/>
+                    </a:prstGeom>
+                  </pic:spPr>
+                </pic:pic>
+              </a:graphicData>
+            </a:graphic>
+          </wp:inline>
+        </w:drawing>
+      </w:r>
+    </w:p>
+    <w:p>
+      <w:r>
+        <w:t xml:space="preserve">Una vez enviada la petición, automáticamente se </w:t>
+      </w:r>
+      <w:proofErr w:type="spellStart"/>
+      <w:r>
+        <w:t>creo</w:t>
+      </w:r>
+      <w:proofErr w:type="spellEnd"/>
+      <w:r>
+        <w:t xml:space="preserve"> el proveedor en la base de datos:</w:t>
+      </w:r>
+    </w:p>
+    <w:p>
+      <w:r>
+        <w:rPr>
+          <w:noProof/>
+        </w:rPr>
+        <w:drawing>
+          <wp:inline distT="0" distB="0" distL="0" distR="0" wp14:anchorId="631896AF" wp14:editId="70BEF2E4">
+            <wp:extent cx="5943600" cy="358140"/>
+            <wp:effectExtent l="0" t="0" r="0" b="3810"/>
+            <wp:docPr id="7" name="Imagen 7"/>
+            <wp:cNvGraphicFramePr>
+              <a:graphicFrameLocks xmlns:a="http://schemas.openxmlformats.org/drawingml/2006/main" noChangeAspect="1"/>
+            </wp:cNvGraphicFramePr>
+            <a:graphic xmlns:a="http://schemas.openxmlformats.org/drawingml/2006/main">
+              <a:graphicData uri="http://schemas.openxmlformats.org/drawingml/2006/picture">
+                <pic:pic xmlns:pic="http://schemas.openxmlformats.org/drawingml/2006/picture">
+                  <pic:nvPicPr>
+                    <pic:cNvPr id="1" name=""/>
+                    <pic:cNvPicPr/>
+                  </pic:nvPicPr>
+                  <pic:blipFill>
+                    <a:blip r:embed="rId12"/>
+                    <a:stretch>
+                      <a:fillRect/>
+                    </a:stretch>
+                  </pic:blipFill>
+                  <pic:spPr>
+                    <a:xfrm>
+                      <a:off x="0" y="0"/>
+                      <a:ext cx="5943600" cy="358140"/>
+                    </a:xfrm>
+                    <a:prstGeom prst="rect">
+                      <a:avLst/>
+                    </a:prstGeom>
+                  </pic:spPr>
+                </pic:pic>
+              </a:graphicData>
+            </a:graphic>
+          </wp:inline>
+        </w:drawing>
+      </w:r>
+    </w:p>
+    <w:p>
+      <w:r>
+        <w:t xml:space="preserve">Y se </w:t>
+      </w:r>
+      <w:r>
+        <w:t>retornó</w:t>
+      </w:r>
+      <w:r>
+        <w:t xml:space="preserve"> la respuesta de que el registro fue guardado:</w:t>
+      </w:r>
+    </w:p>
+    <w:p>
+      <w:r>
+        <w:rPr>
+          <w:noProof/>
+        </w:rPr>
+        <w:drawing>
+          <wp:inline distT="0" distB="0" distL="0" distR="0" wp14:anchorId="33858230" wp14:editId="77026256">
+            <wp:extent cx="5943600" cy="1595120"/>
+            <wp:effectExtent l="0" t="0" r="0" b="5080"/>
+            <wp:docPr id="9" name="Imagen 9"/>
+            <wp:cNvGraphicFramePr>
+              <a:graphicFrameLocks xmlns:a="http://schemas.openxmlformats.org/drawingml/2006/main" noChangeAspect="1"/>
+            </wp:cNvGraphicFramePr>
+            <a:graphic xmlns:a="http://schemas.openxmlformats.org/drawingml/2006/main">
+              <a:graphicData uri="http://schemas.openxmlformats.org/drawingml/2006/picture">
+                <pic:pic xmlns:pic="http://schemas.openxmlformats.org/drawingml/2006/picture">
+                  <pic:nvPicPr>
+                    <pic:cNvPr id="1" name=""/>
+                    <pic:cNvPicPr/>
+                  </pic:nvPicPr>
+                  <pic:blipFill>
+                    <a:blip r:embed="rId13"/>
+                    <a:stretch>
+                      <a:fillRect/>
+                    </a:stretch>
+                  </pic:blipFill>
+                  <pic:spPr>
+                    <a:xfrm>
+                      <a:off x="0" y="0"/>
+                      <a:ext cx="5943600" cy="1595120"/>
+                    </a:xfrm>
+                    <a:prstGeom prst="rect">
+                      <a:avLst/>
+                    </a:prstGeom>
+                  </pic:spPr>
+                </pic:pic>
+              </a:graphicData>
+            </a:graphic>
+          </wp:inline>
+        </w:drawing>
+      </w:r>
+    </w:p>
+    <w:p/>
+    <w:p/>
+    <w:p/>
+    <w:p/>
     <w:sectPr>
-      <w:headerReference w:type="default" r:id="rId8"/>
+      <w:headerReference w:type="default" r:id="rId14"/>
       <w:pgSz w:w="12240" w:h="15840"/>
       <w:pgMar w:top="1440" w:right="1440" w:bottom="1440" w:left="1440" w:header="709" w:footer="709" w:gutter="0"/>
       <w:cols w:space="720"/>
@@ -3271,7 +4542,6 @@
       <w:tblStyle w:val="Tablaconcuadrcula"/>
       <w:tblW w:w="0" w:type="auto"/>
       <w:jc w:val="center"/>
-      <w:tblInd w:w="0" w:type="dxa"/>
       <w:tblBorders>
         <w:top w:val="none" w:sz="0" w:space="0" w:color="auto"/>
         <w:left w:val="none" w:sz="0" w:space="0" w:color="auto"/>
@@ -3371,10 +4641,7 @@
             <w:jc w:val="center"/>
           </w:pPr>
           <w:r>
-            <w:t>PATRO</w:t>
-          </w:r>
-          <w:r>
-            <w:t>NES DE DISEÑO DE SOFTWARE</w:t>
+            <w:t>PATRONES DE DISEÑO DE SOFTWARE</w:t>
           </w:r>
         </w:p>
         <w:p>
@@ -3515,6 +4782,7 @@
     <w:lvl w:ilvl="0">
       <w:start w:val="1"/>
       <w:numFmt w:val="decimal"/>
+      <w:pStyle w:val="Listaconnmeros"/>
       <w:lvlText w:val="%1."/>
       <w:lvlJc w:val="left"/>
       <w:pPr>
@@ -3532,6 +4800,7 @@
     <w:lvl w:ilvl="0">
       <w:start w:val="1"/>
       <w:numFmt w:val="bullet"/>
+      <w:pStyle w:val="Listaconvietas"/>
       <w:lvlText w:val=""/>
       <w:lvlJc w:val="left"/>
       <w:pPr>
@@ -3552,6 +4821,7 @@
     <w:lvl w:ilvl="0">
       <w:start w:val="1"/>
       <w:numFmt w:val="decimal"/>
+      <w:pStyle w:val="Ttulo1"/>
       <w:lvlText w:val="%1"/>
       <w:lvlJc w:val="left"/>
       <w:pPr>
@@ -3561,6 +4831,7 @@
     <w:lvl w:ilvl="1">
       <w:start w:val="1"/>
       <w:numFmt w:val="decimal"/>
+      <w:pStyle w:val="Ttulo2"/>
       <w:lvlText w:val="%1.%2"/>
       <w:lvlJc w:val="left"/>
       <w:pPr>
@@ -3570,6 +4841,7 @@
     <w:lvl w:ilvl="2">
       <w:start w:val="1"/>
       <w:numFmt w:val="decimal"/>
+      <w:pStyle w:val="Ttulo3"/>
       <w:lvlText w:val="%1.%2.%3"/>
       <w:lvlJc w:val="left"/>
       <w:pPr>
@@ -3579,6 +4851,7 @@
     <w:lvl w:ilvl="3">
       <w:start w:val="1"/>
       <w:numFmt w:val="decimal"/>
+      <w:pStyle w:val="Ttulo4"/>
       <w:lvlText w:val="%1.%2.%3.%4"/>
       <w:lvlJc w:val="left"/>
       <w:pPr>
@@ -3588,6 +4861,7 @@
     <w:lvl w:ilvl="4">
       <w:start w:val="1"/>
       <w:numFmt w:val="decimal"/>
+      <w:pStyle w:val="Ttulo5"/>
       <w:lvlText w:val="%1.%2.%3.%4.%5"/>
       <w:lvlJc w:val="left"/>
       <w:pPr>
@@ -3597,6 +4871,7 @@
     <w:lvl w:ilvl="5">
       <w:start w:val="1"/>
       <w:numFmt w:val="decimal"/>
+      <w:pStyle w:val="Ttulo6"/>
       <w:lvlText w:val="%1.%2.%3.%4.%5.%6"/>
       <w:lvlJc w:val="left"/>
       <w:pPr>
@@ -3606,6 +4881,7 @@
     <w:lvl w:ilvl="6">
       <w:start w:val="1"/>
       <w:numFmt w:val="decimal"/>
+      <w:pStyle w:val="Ttulo7"/>
       <w:lvlText w:val="%1.%2.%3.%4.%5.%6.%7"/>
       <w:lvlJc w:val="left"/>
       <w:pPr>
@@ -3615,6 +4891,7 @@
     <w:lvl w:ilvl="7">
       <w:start w:val="1"/>
       <w:numFmt w:val="decimal"/>
+      <w:pStyle w:val="Ttulo8"/>
       <w:lvlText w:val="%1.%2.%3.%4.%5.%6.%7.%8"/>
       <w:lvlJc w:val="left"/>
       <w:pPr>
@@ -3624,6 +4901,7 @@
     <w:lvl w:ilvl="8">
       <w:start w:val="1"/>
       <w:numFmt w:val="decimal"/>
+      <w:pStyle w:val="Ttulo9"/>
       <w:lvlText w:val="%1.%2.%3.%4.%5.%6.%7.%8.%9"/>
       <w:lvlJc w:val="left"/>
       <w:pPr>
@@ -4498,15 +5776,16 @@
   <w:style w:type="character" w:default="1" w:styleId="Fuentedeprrafopredeter">
     <w:name w:val="Default Paragraph Font"/>
     <w:uiPriority w:val="1"/>
+    <w:semiHidden/>
     <w:unhideWhenUsed/>
-    <w:qFormat/>
   </w:style>
   <w:style w:type="table" w:default="1" w:styleId="Tablanormal">
     <w:name w:val="Normal Table"/>
     <w:uiPriority w:val="99"/>
+    <w:semiHidden/>
     <w:unhideWhenUsed/>
-    <w:qFormat/>
     <w:tblPr>
+      <w:tblInd w:w="0" w:type="dxa"/>
       <w:tblCellMar>
         <w:top w:w="0" w:type="dxa"/>
         <w:left w:w="108" w:type="dxa"/>
@@ -4927,8 +6206,8 @@
       <w:contextualSpacing/>
     </w:pPr>
   </w:style>
-  <w:style w:type="character" w:customStyle="1" w:styleId="IntenseEmphasis">
-    <w:name w:val="Intense Emphasis"/>
+  <w:style w:type="character" w:customStyle="1" w:styleId="nfasisintenso1">
+    <w:name w:val="Énfasis intenso1"/>
     <w:basedOn w:val="Fuentedeprrafopredeter"/>
     <w:uiPriority w:val="21"/>
     <w:qFormat/>
@@ -4972,8 +6251,8 @@
       <w:color w:val="0F4761"/>
     </w:rPr>
   </w:style>
-  <w:style w:type="character" w:customStyle="1" w:styleId="IntenseReference">
-    <w:name w:val="Intense Reference"/>
+  <w:style w:type="character" w:customStyle="1" w:styleId="Referenciaintensa1">
+    <w:name w:val="Referencia intensa1"/>
     <w:basedOn w:val="Fuentedeprrafopredeter"/>
     <w:uiPriority w:val="32"/>
     <w:qFormat/>
@@ -5058,8 +6337,8 @@
       </w:tcPr>
     </w:tblStylePr>
   </w:style>
-  <w:style w:type="paragraph" w:customStyle="1" w:styleId="TOCHeading">
-    <w:name w:val="TOC Heading"/>
+  <w:style w:type="paragraph" w:customStyle="1" w:styleId="TtuloTDC1">
+    <w:name w:val="Título TDC1"/>
     <w:basedOn w:val="Ttulo1"/>
     <w:next w:val="Normal"/>
     <w:uiPriority w:val="39"/>

</xml_diff>

<commit_message>
Explicacion del patron factory method
</commit_message>
<xml_diff>
--- a/Sistema de Gestion de Cadenas de Suministro.docx
+++ b/Sistema de Gestion de Cadenas de Suministro.docx
@@ -3549,6 +3549,290 @@
         <w:pStyle w:val="Ttulo3"/>
       </w:pPr>
       <w:bookmarkStart w:id="25" w:name="_Toc239179237"/>
+      <w:bookmarkStart w:id="26" w:name="_Toc239179238"/>
+      <w:r>
+        <w:t xml:space="preserve">Como </w:t>
+      </w:r>
+      <w:r>
+        <w:t>e</w:t>
+      </w:r>
+      <w:r>
+        <w:t xml:space="preserve">stá Colaborando </w:t>
+      </w:r>
+      <w:r>
+        <w:t>e</w:t>
+      </w:r>
+      <w:r>
+        <w:t>ste Patrón al Proyecto</w:t>
+      </w:r>
+      <w:bookmarkEnd w:id="26"/>
+    </w:p>
+    <w:p>
+      <w:r>
+        <w:t xml:space="preserve">Para entender como este patrón está colaborando con nuestro proyecto, primeramente, hay que irnos a los conceptos fundamentales del </w:t>
+      </w:r>
+      <w:proofErr w:type="spellStart"/>
+      <w:r>
+        <w:t>framework</w:t>
+      </w:r>
+      <w:proofErr w:type="spellEnd"/>
+      <w:r>
+        <w:t xml:space="preserve"> que estamos utilizando. El </w:t>
+      </w:r>
+      <w:proofErr w:type="spellStart"/>
+      <w:r>
+        <w:t>framework</w:t>
+      </w:r>
+      <w:proofErr w:type="spellEnd"/>
+      <w:r>
+        <w:t xml:space="preserve"> que nosotros estamos usando para este proyecto, es </w:t>
+      </w:r>
+      <w:r>
+        <w:rPr>
+          <w:b/>
+          <w:bCs/>
+        </w:rPr>
+        <w:t>Spring Framework</w:t>
+      </w:r>
+      <w:r>
+        <w:t xml:space="preserve">, es un </w:t>
+      </w:r>
+      <w:proofErr w:type="spellStart"/>
+      <w:r>
+        <w:t>framework</w:t>
+      </w:r>
+      <w:proofErr w:type="spellEnd"/>
+      <w:r>
+        <w:t xml:space="preserve"> de Java que en conjunto con la herramienta </w:t>
+      </w:r>
+      <w:r>
+        <w:rPr>
+          <w:b/>
+          <w:bCs/>
+        </w:rPr>
+        <w:t xml:space="preserve">Spring </w:t>
+      </w:r>
+      <w:proofErr w:type="spellStart"/>
+      <w:r>
+        <w:rPr>
+          <w:b/>
+          <w:bCs/>
+        </w:rPr>
+        <w:t>Boot</w:t>
+      </w:r>
+      <w:proofErr w:type="spellEnd"/>
+      <w:r>
+        <w:rPr>
+          <w:b/>
+          <w:bCs/>
+        </w:rPr>
+        <w:t xml:space="preserve"> </w:t>
+      </w:r>
+      <w:r>
+        <w:t xml:space="preserve">ayudan a crear muchos tipos diferentes de sistemas de una manera sencilla. </w:t>
+      </w:r>
+      <w:r>
+        <w:rPr>
+          <w:b/>
+          <w:bCs/>
+        </w:rPr>
+        <w:t>Spring</w:t>
+      </w:r>
+      <w:r>
+        <w:t xml:space="preserve">, internamente maneja </w:t>
+      </w:r>
+      <w:proofErr w:type="spellStart"/>
+      <w:r>
+        <w:rPr>
+          <w:b/>
+          <w:bCs/>
+        </w:rPr>
+        <w:t>Beans</w:t>
+      </w:r>
+      <w:proofErr w:type="spellEnd"/>
+      <w:r>
+        <w:t xml:space="preserve">, los cuales son objetos que son instanciados, configurados y gestionados por un contenedor llamado </w:t>
+      </w:r>
+      <w:r>
+        <w:rPr>
+          <w:b/>
+          <w:bCs/>
+        </w:rPr>
+        <w:t>Inversión de Control (</w:t>
+      </w:r>
+      <w:proofErr w:type="spellStart"/>
+      <w:r>
+        <w:rPr>
+          <w:b/>
+          <w:bCs/>
+        </w:rPr>
+        <w:t>IoC</w:t>
+      </w:r>
+      <w:proofErr w:type="spellEnd"/>
+      <w:r>
+        <w:rPr>
+          <w:b/>
+          <w:bCs/>
+        </w:rPr>
+        <w:t>)</w:t>
+      </w:r>
+      <w:r>
+        <w:t xml:space="preserve">. Estos </w:t>
+      </w:r>
+      <w:proofErr w:type="spellStart"/>
+      <w:r>
+        <w:rPr>
+          <w:b/>
+          <w:bCs/>
+        </w:rPr>
+        <w:t>Beans</w:t>
+      </w:r>
+      <w:proofErr w:type="spellEnd"/>
+      <w:r>
+        <w:rPr>
+          <w:b/>
+          <w:bCs/>
+        </w:rPr>
+        <w:t xml:space="preserve"> </w:t>
+      </w:r>
+      <w:r>
+        <w:t xml:space="preserve">pueden estar divididos en diferentes tipos según el uso que se le vaya a dar, para este caso, tenemos los </w:t>
+      </w:r>
+      <w:r>
+        <w:rPr>
+          <w:b/>
+          <w:bCs/>
+        </w:rPr>
+        <w:t>@RestControllers, @Services</w:t>
+      </w:r>
+      <w:r>
+        <w:t xml:space="preserve"> y </w:t>
+      </w:r>
+      <w:r>
+        <w:rPr>
+          <w:b/>
+          <w:bCs/>
+        </w:rPr>
+        <w:t>@Component</w:t>
+      </w:r>
+      <w:r>
+        <w:t xml:space="preserve">. El contenedor </w:t>
+      </w:r>
+      <w:proofErr w:type="spellStart"/>
+      <w:r>
+        <w:rPr>
+          <w:b/>
+          <w:bCs/>
+        </w:rPr>
+        <w:t>IoC</w:t>
+      </w:r>
+      <w:proofErr w:type="spellEnd"/>
+      <w:r>
+        <w:t xml:space="preserve"> internamente </w:t>
+      </w:r>
+      <w:r>
+        <w:rPr>
+          <w:b/>
+          <w:bCs/>
+        </w:rPr>
+        <w:t xml:space="preserve">aplica el patrón </w:t>
+      </w:r>
+      <w:proofErr w:type="spellStart"/>
+      <w:r>
+        <w:rPr>
+          <w:b/>
+          <w:bCs/>
+        </w:rPr>
+        <w:t>singleton</w:t>
+      </w:r>
+      <w:proofErr w:type="spellEnd"/>
+      <w:r>
+        <w:t xml:space="preserve"> para dar una </w:t>
+      </w:r>
+      <w:r>
+        <w:rPr>
+          <w:b/>
+          <w:bCs/>
+        </w:rPr>
+        <w:t>mayor eficiencia de memoria</w:t>
+      </w:r>
+      <w:r>
+        <w:t xml:space="preserve"> haciendo que para cada </w:t>
+      </w:r>
+      <w:proofErr w:type="spellStart"/>
+      <w:r>
+        <w:rPr>
+          <w:b/>
+          <w:bCs/>
+        </w:rPr>
+        <w:t>Bean</w:t>
+      </w:r>
+      <w:proofErr w:type="spellEnd"/>
+      <w:r>
+        <w:t xml:space="preserve"> que se vaya a instanciar y gestionar, se maneje una </w:t>
+      </w:r>
+      <w:r>
+        <w:rPr>
+          <w:b/>
+          <w:bCs/>
+        </w:rPr>
+        <w:t>única instancia compartida</w:t>
+      </w:r>
+      <w:r>
+        <w:t xml:space="preserve"> y que también por medio de ello se pueda aplicar el patrón de diseño de </w:t>
+      </w:r>
+      <w:r>
+        <w:rPr>
+          <w:b/>
+          <w:bCs/>
+        </w:rPr>
+        <w:t>inyección de dependencias.</w:t>
+      </w:r>
+    </w:p>
+    <w:p>
+      <w:r>
+        <w:t xml:space="preserve">Aplicar este patrón aquí es muy importante ya que como dijimos anteriormente, permite tener una mayor eficiencia de memoria, aplicar principios como la inyección de dependencias (lo cual es muy importante en Spring) y otras cosas como tener una mayor velocidad de respuesta y que el </w:t>
+      </w:r>
+      <w:proofErr w:type="spellStart"/>
+      <w:r>
+        <w:rPr>
+          <w:b/>
+          <w:bCs/>
+        </w:rPr>
+        <w:t>Garbage</w:t>
+      </w:r>
+      <w:proofErr w:type="spellEnd"/>
+      <w:r>
+        <w:rPr>
+          <w:b/>
+          <w:bCs/>
+        </w:rPr>
+        <w:t xml:space="preserve"> </w:t>
+      </w:r>
+      <w:proofErr w:type="spellStart"/>
+      <w:r>
+        <w:rPr>
+          <w:b/>
+          <w:bCs/>
+        </w:rPr>
+        <w:t>Collection</w:t>
+      </w:r>
+      <w:proofErr w:type="spellEnd"/>
+      <w:r>
+        <w:rPr>
+          <w:b/>
+          <w:bCs/>
+        </w:rPr>
+        <w:t xml:space="preserve"> </w:t>
+      </w:r>
+      <w:r>
+        <w:t>de Java trabaje de una manera mucho más eficiente mejorando el rendimiento global.</w:t>
+      </w:r>
+    </w:p>
+    <w:p>
+      <w:pPr>
+        <w:pStyle w:val="Ttulo3"/>
+      </w:pPr>
       <w:r>
         <w:t>Evidencia</w:t>
       </w:r>
@@ -3607,6 +3891,7 @@
         <w:rPr>
           <w:noProof/>
         </w:rPr>
+        <w:lastRenderedPageBreak/>
         <w:drawing>
           <wp:inline distT="0" distB="0" distL="0" distR="0" wp14:anchorId="7B191849" wp14:editId="486E0DED">
             <wp:extent cx="5943600" cy="2027555"/>
@@ -3649,7 +3934,6 @@
         <w:rPr>
           <w:noProof/>
         </w:rPr>
-        <w:lastRenderedPageBreak/>
         <w:drawing>
           <wp:inline distT="0" distB="0" distL="0" distR="0" wp14:anchorId="667BBF95" wp14:editId="7E5F0459">
             <wp:extent cx="5943600" cy="2758440"/>
@@ -3691,77 +3975,252 @@
       <w:pPr>
         <w:pStyle w:val="Ttulo3"/>
       </w:pPr>
-      <w:bookmarkStart w:id="26" w:name="_Toc239179238"/>
-      <w:r>
-        <w:t>Como Está Colaborando Este Patrón al Proyecto</w:t>
-      </w:r>
-      <w:bookmarkEnd w:id="26"/>
-    </w:p>
-    <w:p>
-      <w:r>
-        <w:t xml:space="preserve">Para entender como este patrón </w:t>
+      <w:bookmarkStart w:id="27" w:name="_Toc239179239"/>
+      <w:r>
+        <w:t xml:space="preserve">Explicación y </w:t>
+      </w:r>
+      <w:r>
+        <w:t>Prueba de que Funciona</w:t>
+      </w:r>
+      <w:bookmarkEnd w:id="27"/>
+    </w:p>
+    <w:p>
+      <w:r>
+        <w:t xml:space="preserve">Bueno, </w:t>
+      </w:r>
+      <w:r>
+        <w:t>primeramente,</w:t>
+      </w:r>
+      <w:r>
+        <w:t xml:space="preserve"> daremos una breve explicación de que hace cada parte de la evidencia que adjuntamos en el apartado </w:t>
+      </w:r>
+      <w:r>
+        <w:rPr>
+          <w:b/>
+          <w:bCs/>
+        </w:rPr>
+        <w:t>8.1.</w:t>
+      </w:r>
+      <w:r>
+        <w:rPr>
+          <w:b/>
+          <w:bCs/>
+        </w:rPr>
+        <w:t>2</w:t>
+      </w:r>
+      <w:r>
+        <w:rPr>
+          <w:b/>
+          <w:bCs/>
+        </w:rPr>
+        <w:t xml:space="preserve">. </w:t>
+      </w:r>
+      <w:r>
+        <w:t xml:space="preserve">Es importante resaltar que esta evidencia adjunta </w:t>
       </w:r>
       <w:r>
         <w:t>está</w:t>
       </w:r>
       <w:r>
-        <w:t xml:space="preserve"> colaborando con nuestro proyecto</w:t>
-      </w:r>
-      <w:r>
-        <w:t>,</w:t>
-      </w:r>
+        <w:t xml:space="preserve"> ubicada en la funcionalidad de </w:t>
+      </w:r>
+      <w:r>
+        <w:rPr>
+          <w:b/>
+          <w:bCs/>
+        </w:rPr>
+        <w:t>creación de proveedores</w:t>
+      </w:r>
+      <w:r>
+        <w:t xml:space="preserve"> en el </w:t>
+      </w:r>
+      <w:proofErr w:type="spellStart"/>
+      <w:r>
+        <w:rPr>
+          <w:b/>
+          <w:bCs/>
+        </w:rPr>
+        <w:t>backend</w:t>
+      </w:r>
+      <w:proofErr w:type="spellEnd"/>
+      <w:r>
+        <w:t xml:space="preserve">. Sin embargo, este patrón </w:t>
+      </w:r>
+      <w:r>
+        <w:t>está</w:t>
+      </w:r>
+      <w:r>
+        <w:t xml:space="preserve"> siendo utilizado en muchas otras partes también. Las evidencias que adjuntamos solo son una parte de todo lo que es esta funcionalidad, pero es, por así decirlo, el núcleo para que funcione.</w:t>
+      </w:r>
+    </w:p>
+    <w:p>
+      <w:pPr>
+        <w:pStyle w:val="Ttulo4"/>
+        <w:rPr>
+          <w:lang w:val="en-US"/>
+        </w:rPr>
+      </w:pPr>
+      <w:r>
+        <w:rPr>
+          <w:lang w:val="en-US"/>
+        </w:rPr>
+        <w:t xml:space="preserve">@RestController </w:t>
+      </w:r>
+      <w:proofErr w:type="spellStart"/>
+      <w:r>
+        <w:rPr>
+          <w:lang w:val="en-US"/>
+        </w:rPr>
+        <w:t>SupplierController</w:t>
+      </w:r>
+      <w:proofErr w:type="spellEnd"/>
+    </w:p>
+    <w:p>
+      <w:r>
+        <w:t xml:space="preserve">Este componente es el </w:t>
+      </w:r>
+      <w:r>
+        <w:t xml:space="preserve">encargado de recibir la petición del usuario por medio del </w:t>
+      </w:r>
+      <w:proofErr w:type="spellStart"/>
+      <w:r>
+        <w:t>endpoint</w:t>
+      </w:r>
+      <w:proofErr w:type="spellEnd"/>
       <w:r>
         <w:t xml:space="preserve"> </w:t>
       </w:r>
       <w:r>
-        <w:t>primeramente,</w:t>
-      </w:r>
-      <w:r>
-        <w:t xml:space="preserve"> hay que irnos a los conceptos fundamentales del </w:t>
+        <w:rPr>
+          <w:b/>
+          <w:bCs/>
+        </w:rPr>
+        <w:t>“/api/</w:t>
       </w:r>
       <w:proofErr w:type="spellStart"/>
       <w:r>
-        <w:t>framework</w:t>
+        <w:rPr>
+          <w:b/>
+          <w:bCs/>
+        </w:rPr>
+        <w:t>supplier</w:t>
       </w:r>
       <w:proofErr w:type="spellEnd"/>
       <w:r>
-        <w:t xml:space="preserve"> que estamos utilizando. El </w:t>
+        <w:rPr>
+          <w:b/>
+          <w:bCs/>
+        </w:rPr>
+        <w:t>”</w:t>
+      </w:r>
+      <w:r>
+        <w:rPr>
+          <w:b/>
+          <w:bCs/>
+        </w:rPr>
+        <w:t xml:space="preserve"> </w:t>
+      </w:r>
+      <w:r>
+        <w:t xml:space="preserve">y dirigir la información al </w:t>
+      </w:r>
+      <w:r>
+        <w:rPr>
+          <w:b/>
+          <w:bCs/>
+        </w:rPr>
+        <w:t>@Service</w:t>
+      </w:r>
+      <w:r>
+        <w:rPr>
+          <w:b/>
+          <w:bCs/>
+        </w:rPr>
+        <w:t xml:space="preserve"> </w:t>
+      </w:r>
+      <w:r>
+        <w:t xml:space="preserve">que se encargara de orquestar el flujo de creación del proveedor. </w:t>
+      </w:r>
+      <w:r>
+        <w:lastRenderedPageBreak/>
+        <w:t>Asimismo, él se encarga también de devolverle la correspondiente respuesta al usuario cuando el proveedor haya sido creado.</w:t>
+      </w:r>
+    </w:p>
+    <w:p>
+      <w:pPr>
+        <w:pStyle w:val="Ttulo4"/>
+        <w:rPr>
+          <w:lang w:val="en-US"/>
+        </w:rPr>
+      </w:pPr>
+      <w:r>
+        <w:rPr>
+          <w:lang w:val="en-US"/>
+        </w:rPr>
+        <w:t xml:space="preserve">@Service </w:t>
       </w:r>
       <w:proofErr w:type="spellStart"/>
       <w:r>
-        <w:t>framework</w:t>
+        <w:rPr>
+          <w:lang w:val="en-US"/>
+        </w:rPr>
+        <w:t>SupplierService</w:t>
       </w:r>
       <w:proofErr w:type="spellEnd"/>
-      <w:r>
-        <w:t xml:space="preserve"> que nosotros estamos usando para este proyecto, es </w:t>
-      </w:r>
-      <w:r>
-        <w:rPr>
-          <w:b/>
-          <w:bCs/>
-        </w:rPr>
-        <w:t>Spring Framework</w:t>
-      </w:r>
-      <w:r>
-        <w:t xml:space="preserve">, es un </w:t>
+    </w:p>
+    <w:p>
+      <w:pPr>
+        <w:rPr>
+          <w:b/>
+          <w:bCs/>
+        </w:rPr>
+      </w:pPr>
+      <w:r>
+        <w:t xml:space="preserve">Aquí se maneja la </w:t>
+      </w:r>
+      <w:r>
+        <w:t xml:space="preserve">orquestación del flujo de creación del proveedor, donde se capturan los datos que llegan, se hacen su correspondiente mapeo a entidad de dominio (estamos usando arquitectura hexagonal) y posteriormente se le pasa al </w:t>
+      </w:r>
+      <w:r>
+        <w:rPr>
+          <w:b/>
+          <w:bCs/>
+        </w:rPr>
+        <w:t xml:space="preserve">@Component </w:t>
+      </w:r>
+      <w:r>
+        <w:t xml:space="preserve">encargado de manejar la persistencia en la base de datos. Asimismo, cuando se obtiene una respuesta, se la envía al </w:t>
+      </w:r>
+      <w:r>
+        <w:rPr>
+          <w:b/>
+          <w:bCs/>
+        </w:rPr>
+        <w:t>@RestController</w:t>
+      </w:r>
+    </w:p>
+    <w:p>
+      <w:pPr>
+        <w:pStyle w:val="Ttulo4"/>
+      </w:pPr>
+      <w:r>
+        <w:t xml:space="preserve">@Component </w:t>
       </w:r>
       <w:proofErr w:type="spellStart"/>
       <w:r>
-        <w:t>framework</w:t>
+        <w:t>SupplierAdapterPersistence</w:t>
       </w:r>
       <w:proofErr w:type="spellEnd"/>
-      <w:r>
-        <w:t xml:space="preserve"> de Java que en conjunto con </w:t>
-      </w:r>
-      <w:r>
-        <w:t xml:space="preserve">la herramienta </w:t>
-      </w:r>
-      <w:r>
-        <w:rPr>
-          <w:b/>
-          <w:bCs/>
-        </w:rPr>
-        <w:t xml:space="preserve">Spring </w:t>
+    </w:p>
+    <w:p>
+      <w:r>
+        <w:t xml:space="preserve">En este apartado se maneja lo que es la comunicación con el componente interno que se encarga de recibir los datos para persistirlos definitivamente en la base de datos mediante </w:t>
+      </w:r>
+      <w:r>
+        <w:rPr>
+          <w:b/>
+          <w:bCs/>
+        </w:rPr>
+        <w:t xml:space="preserve">JPA e </w:t>
       </w:r>
       <w:proofErr w:type="spellStart"/>
       <w:r>
@@ -3769,7 +4228,7 @@
           <w:b/>
           <w:bCs/>
         </w:rPr>
-        <w:t>Boot</w:t>
+        <w:t>Hibernate</w:t>
       </w:r>
       <w:proofErr w:type="spellEnd"/>
       <w:r>
@@ -3777,20 +4236,43 @@
           <w:b/>
           <w:bCs/>
         </w:rPr>
-        <w:t xml:space="preserve"> </w:t>
-      </w:r>
-      <w:r>
-        <w:t xml:space="preserve">ayudan a crear muchos tipos diferentes de sistemas de una manera sencilla. </w:t>
-      </w:r>
-      <w:r>
-        <w:rPr>
-          <w:b/>
-          <w:bCs/>
-        </w:rPr>
-        <w:t>Spring</w:t>
-      </w:r>
-      <w:r>
-        <w:t xml:space="preserve">, internamente maneja </w:t>
+        <w:t xml:space="preserve">. </w:t>
+      </w:r>
+      <w:r>
+        <w:t xml:space="preserve">Primeramente, se reciben los datos que llegan del </w:t>
+      </w:r>
+      <w:r>
+        <w:rPr>
+          <w:b/>
+          <w:bCs/>
+        </w:rPr>
+        <w:t xml:space="preserve">@Service </w:t>
+      </w:r>
+      <w:r>
+        <w:t xml:space="preserve">y se envían al repositorio para guardarlos, después de ello, se envía la respuesta obtenida al </w:t>
+      </w:r>
+      <w:r>
+        <w:rPr>
+          <w:b/>
+          <w:bCs/>
+        </w:rPr>
+        <w:t xml:space="preserve">@Service </w:t>
+      </w:r>
+      <w:r>
+        <w:t>nuevamente.</w:t>
+      </w:r>
+    </w:p>
+    <w:p>
+      <w:pPr>
+        <w:pStyle w:val="Ttulo4"/>
+      </w:pPr>
+      <w:r>
+        <w:t>Funcionamiento</w:t>
+      </w:r>
+    </w:p>
+    <w:p>
+      <w:r>
+        <w:t xml:space="preserve">Ahora sí, para la prueba de funcionamiento, ya que todavía no contamos con una interfaz gráfica en el </w:t>
       </w:r>
       <w:proofErr w:type="spellStart"/>
       <w:r>
@@ -3798,18 +4280,11 @@
           <w:b/>
           <w:bCs/>
         </w:rPr>
-        <w:t>Beans</w:t>
+        <w:t>frontend</w:t>
       </w:r>
       <w:proofErr w:type="spellEnd"/>
       <w:r>
-        <w:t xml:space="preserve">, los cuales son objetos que son instanciados, configurados y gestionados por un contenedor llamado </w:t>
-      </w:r>
-      <w:r>
-        <w:rPr>
-          <w:b/>
-          <w:bCs/>
-        </w:rPr>
-        <w:t>Inversión de Control (</w:t>
+        <w:t xml:space="preserve">, utilizamos la herramienta </w:t>
       </w:r>
       <w:proofErr w:type="spellStart"/>
       <w:r>
@@ -3817,497 +4292,10 @@
           <w:b/>
           <w:bCs/>
         </w:rPr>
-        <w:t>IoC</w:t>
+        <w:t>Postman</w:t>
       </w:r>
       <w:proofErr w:type="spellEnd"/>
       <w:r>
-        <w:rPr>
-          <w:b/>
-          <w:bCs/>
-        </w:rPr>
-        <w:t>)</w:t>
-      </w:r>
-      <w:r>
-        <w:t xml:space="preserve">. Estos </w:t>
-      </w:r>
-      <w:proofErr w:type="spellStart"/>
-      <w:r>
-        <w:rPr>
-          <w:b/>
-          <w:bCs/>
-        </w:rPr>
-        <w:t>Beans</w:t>
-      </w:r>
-      <w:proofErr w:type="spellEnd"/>
-      <w:r>
-        <w:rPr>
-          <w:b/>
-          <w:bCs/>
-        </w:rPr>
-        <w:t xml:space="preserve"> </w:t>
-      </w:r>
-      <w:r>
-        <w:t xml:space="preserve">pueden estar divididos en diferentes tipos según el uso que se le vaya a dar, para este caso, tenemos los </w:t>
-      </w:r>
-      <w:r>
-        <w:rPr>
-          <w:b/>
-          <w:bCs/>
-        </w:rPr>
-        <w:t>@RestControllers, @Services</w:t>
-      </w:r>
-      <w:r>
-        <w:t xml:space="preserve"> y </w:t>
-      </w:r>
-      <w:r>
-        <w:rPr>
-          <w:b/>
-          <w:bCs/>
-        </w:rPr>
-        <w:t>@Component</w:t>
-      </w:r>
-      <w:r>
-        <w:t xml:space="preserve">. El contenedor </w:t>
-      </w:r>
-      <w:proofErr w:type="spellStart"/>
-      <w:r>
-        <w:rPr>
-          <w:b/>
-          <w:bCs/>
-        </w:rPr>
-        <w:t>IoC</w:t>
-      </w:r>
-      <w:proofErr w:type="spellEnd"/>
-      <w:r>
-        <w:t xml:space="preserve"> internamente </w:t>
-      </w:r>
-      <w:r>
-        <w:rPr>
-          <w:b/>
-          <w:bCs/>
-        </w:rPr>
-        <w:t>aplica el patr</w:t>
-      </w:r>
-      <w:r>
-        <w:rPr>
-          <w:b/>
-          <w:bCs/>
-        </w:rPr>
-        <w:t xml:space="preserve">ón </w:t>
-      </w:r>
-      <w:proofErr w:type="spellStart"/>
-      <w:r>
-        <w:rPr>
-          <w:b/>
-          <w:bCs/>
-        </w:rPr>
-        <w:t>singleton</w:t>
-      </w:r>
-      <w:proofErr w:type="spellEnd"/>
-      <w:r>
-        <w:t xml:space="preserve"> para dar una </w:t>
-      </w:r>
-      <w:r>
-        <w:rPr>
-          <w:b/>
-          <w:bCs/>
-        </w:rPr>
-        <w:t>mayor eficiencia de memoria</w:t>
-      </w:r>
-      <w:r>
-        <w:t xml:space="preserve"> haciendo que para cada </w:t>
-      </w:r>
-      <w:proofErr w:type="spellStart"/>
-      <w:r>
-        <w:rPr>
-          <w:b/>
-          <w:bCs/>
-        </w:rPr>
-        <w:t>Bean</w:t>
-      </w:r>
-      <w:proofErr w:type="spellEnd"/>
-      <w:r>
-        <w:t xml:space="preserve"> que se vaya a instanciar y gestionar, se maneje una </w:t>
-      </w:r>
-      <w:r>
-        <w:rPr>
-          <w:b/>
-          <w:bCs/>
-        </w:rPr>
-        <w:t>única instancia compartida</w:t>
-      </w:r>
-      <w:r>
-        <w:t xml:space="preserve"> y que también por medio de ello se pueda aplicar el patrón de diseño de </w:t>
-      </w:r>
-      <w:r>
-        <w:rPr>
-          <w:b/>
-          <w:bCs/>
-        </w:rPr>
-        <w:t>inyección de dependencias.</w:t>
-      </w:r>
-    </w:p>
-    <w:p>
-      <w:r>
-        <w:t xml:space="preserve">Aplicar este patrón aquí es muy importante ya que como dijimos anteriormente, permite tener una mayor eficiencia de memoria, aplicar principios como la inyección de dependencias (lo cual es muy importante en Spring) y otras cosas como tener una mayor velocidad de respuesta y que el </w:t>
-      </w:r>
-      <w:proofErr w:type="spellStart"/>
-      <w:r>
-        <w:rPr>
-          <w:b/>
-          <w:bCs/>
-        </w:rPr>
-        <w:t>Garbage</w:t>
-      </w:r>
-      <w:proofErr w:type="spellEnd"/>
-      <w:r>
-        <w:rPr>
-          <w:b/>
-          <w:bCs/>
-        </w:rPr>
-        <w:t xml:space="preserve"> </w:t>
-      </w:r>
-      <w:proofErr w:type="spellStart"/>
-      <w:r>
-        <w:rPr>
-          <w:b/>
-          <w:bCs/>
-        </w:rPr>
-        <w:t>Collection</w:t>
-      </w:r>
-      <w:proofErr w:type="spellEnd"/>
-      <w:r>
-        <w:rPr>
-          <w:b/>
-          <w:bCs/>
-        </w:rPr>
-        <w:t xml:space="preserve"> </w:t>
-      </w:r>
-      <w:r>
-        <w:t xml:space="preserve">de Java trabaje de una manera mucho </w:t>
-      </w:r>
-      <w:r>
-        <w:t>más</w:t>
-      </w:r>
-      <w:r>
-        <w:t xml:space="preserve"> eficiente mejorando el rendimiento global.</w:t>
-      </w:r>
-    </w:p>
-    <w:p>
-      <w:pPr>
-        <w:pStyle w:val="Ttulo3"/>
-      </w:pPr>
-      <w:bookmarkStart w:id="27" w:name="_Toc239179239"/>
-      <w:r>
-        <w:lastRenderedPageBreak/>
-        <w:t xml:space="preserve">Explicación y </w:t>
-      </w:r>
-      <w:r>
-        <w:t>Prueba de que Funciona</w:t>
-      </w:r>
-      <w:bookmarkEnd w:id="27"/>
-    </w:p>
-    <w:p>
-      <w:r>
-        <w:t xml:space="preserve">Bueno, </w:t>
-      </w:r>
-      <w:r>
-        <w:t>primeramente,</w:t>
-      </w:r>
-      <w:r>
-        <w:t xml:space="preserve"> daremos una breve explicación de que hace cada parte de la evidencia que adjuntamos en el apartado </w:t>
-      </w:r>
-      <w:r>
-        <w:rPr>
-          <w:b/>
-          <w:bCs/>
-        </w:rPr>
-        <w:t>8.1.1</w:t>
-      </w:r>
-      <w:r>
-        <w:rPr>
-          <w:b/>
-          <w:bCs/>
-        </w:rPr>
-        <w:t xml:space="preserve">. </w:t>
-      </w:r>
-      <w:r>
-        <w:t xml:space="preserve">Es importante resaltar que esta evidencia adjunta </w:t>
-      </w:r>
-      <w:r>
-        <w:t>está</w:t>
-      </w:r>
-      <w:r>
-        <w:t xml:space="preserve"> ubicada en la funcionalidad de </w:t>
-      </w:r>
-      <w:r>
-        <w:rPr>
-          <w:b/>
-          <w:bCs/>
-        </w:rPr>
-        <w:t>creación de proveedores</w:t>
-      </w:r>
-      <w:r>
-        <w:t xml:space="preserve"> en el </w:t>
-      </w:r>
-      <w:proofErr w:type="spellStart"/>
-      <w:r>
-        <w:rPr>
-          <w:b/>
-          <w:bCs/>
-        </w:rPr>
-        <w:t>backend</w:t>
-      </w:r>
-      <w:proofErr w:type="spellEnd"/>
-      <w:r>
-        <w:t xml:space="preserve">. Sin embargo, este patrón </w:t>
-      </w:r>
-      <w:r>
-        <w:t>está</w:t>
-      </w:r>
-      <w:r>
-        <w:t xml:space="preserve"> siendo utilizado en muchas otras partes también. Las evidencias que adjuntamos solo son una parte de todo lo que es esta funcionalidad, pero es, por así decirlo, el núcleo para que funcione.</w:t>
-      </w:r>
-    </w:p>
-    <w:p>
-      <w:pPr>
-        <w:pStyle w:val="Ttulo4"/>
-        <w:rPr>
-          <w:lang w:val="en-US"/>
-        </w:rPr>
-      </w:pPr>
-      <w:r>
-        <w:rPr>
-          <w:lang w:val="en-US"/>
-        </w:rPr>
-        <w:t xml:space="preserve">@RestController </w:t>
-      </w:r>
-      <w:proofErr w:type="spellStart"/>
-      <w:r>
-        <w:rPr>
-          <w:lang w:val="en-US"/>
-        </w:rPr>
-        <w:t>SupplierController</w:t>
-      </w:r>
-      <w:proofErr w:type="spellEnd"/>
-    </w:p>
-    <w:p>
-      <w:r>
-        <w:t xml:space="preserve">Este componente es el </w:t>
-      </w:r>
-      <w:r>
-        <w:t xml:space="preserve">encargado de recibir la petición del usuario por medio del </w:t>
-      </w:r>
-      <w:proofErr w:type="spellStart"/>
-      <w:r>
-        <w:t>endpoint</w:t>
-      </w:r>
-      <w:proofErr w:type="spellEnd"/>
-      <w:r>
-        <w:t xml:space="preserve"> </w:t>
-      </w:r>
-      <w:r>
-        <w:rPr>
-          <w:b/>
-          <w:bCs/>
-        </w:rPr>
-        <w:t>“/api/</w:t>
-      </w:r>
-      <w:proofErr w:type="spellStart"/>
-      <w:r>
-        <w:rPr>
-          <w:b/>
-          <w:bCs/>
-        </w:rPr>
-        <w:t>supplier</w:t>
-      </w:r>
-      <w:proofErr w:type="spellEnd"/>
-      <w:r>
-        <w:rPr>
-          <w:b/>
-          <w:bCs/>
-        </w:rPr>
-        <w:t>”</w:t>
-      </w:r>
-      <w:r>
-        <w:rPr>
-          <w:b/>
-          <w:bCs/>
-        </w:rPr>
-        <w:t xml:space="preserve"> </w:t>
-      </w:r>
-      <w:r>
-        <w:t xml:space="preserve">y dirigir la información al </w:t>
-      </w:r>
-      <w:r>
-        <w:rPr>
-          <w:b/>
-          <w:bCs/>
-        </w:rPr>
-        <w:t>@Service</w:t>
-      </w:r>
-      <w:r>
-        <w:rPr>
-          <w:b/>
-          <w:bCs/>
-        </w:rPr>
-        <w:t xml:space="preserve"> </w:t>
-      </w:r>
-      <w:r>
-        <w:t>que se encargara de orquestar el flujo de creación del proveedor. Asimismo, él se encarga también de devolverle la correspondiente respuesta al usuario cuando el proveedor haya sido creado.</w:t>
-      </w:r>
-    </w:p>
-    <w:p>
-      <w:pPr>
-        <w:pStyle w:val="Ttulo4"/>
-        <w:rPr>
-          <w:lang w:val="en-US"/>
-        </w:rPr>
-      </w:pPr>
-      <w:r>
-        <w:rPr>
-          <w:lang w:val="en-US"/>
-        </w:rPr>
-        <w:t xml:space="preserve">@Service </w:t>
-      </w:r>
-      <w:proofErr w:type="spellStart"/>
-      <w:r>
-        <w:rPr>
-          <w:lang w:val="en-US"/>
-        </w:rPr>
-        <w:t>SupplierService</w:t>
-      </w:r>
-      <w:proofErr w:type="spellEnd"/>
-    </w:p>
-    <w:p>
-      <w:pPr>
-        <w:rPr>
-          <w:b/>
-          <w:bCs/>
-        </w:rPr>
-      </w:pPr>
-      <w:r>
-        <w:t xml:space="preserve">Aquí se maneja la </w:t>
-      </w:r>
-      <w:r>
-        <w:t xml:space="preserve">orquestación del flujo de creación del proveedor, donde se capturan los datos que llegan, se hacen su correspondiente mapeo a entidad de dominio (estamos usando arquitectura hexagonal) y posteriormente se le pasa al </w:t>
-      </w:r>
-      <w:r>
-        <w:rPr>
-          <w:b/>
-          <w:bCs/>
-        </w:rPr>
-        <w:t xml:space="preserve">@Component </w:t>
-      </w:r>
-      <w:r>
-        <w:t xml:space="preserve">encargado de manejar la persistencia en la base de datos. Asimismo, cuando se obtiene una respuesta, se la envía al </w:t>
-      </w:r>
-      <w:r>
-        <w:rPr>
-          <w:b/>
-          <w:bCs/>
-        </w:rPr>
-        <w:t>@RestController</w:t>
-      </w:r>
-    </w:p>
-    <w:p>
-      <w:pPr>
-        <w:pStyle w:val="Ttulo4"/>
-      </w:pPr>
-      <w:r>
-        <w:t xml:space="preserve">@Component </w:t>
-      </w:r>
-      <w:proofErr w:type="spellStart"/>
-      <w:r>
-        <w:t>SupplierAdapterPersistence</w:t>
-      </w:r>
-      <w:proofErr w:type="spellEnd"/>
-    </w:p>
-    <w:p>
-      <w:r>
-        <w:t xml:space="preserve">En este apartado se maneja lo que es la comunicación con el componente interno que se encarga de recibir los datos para persistirlos definitivamente en la base de datos mediante </w:t>
-      </w:r>
-      <w:r>
-        <w:rPr>
-          <w:b/>
-          <w:bCs/>
-        </w:rPr>
-        <w:t xml:space="preserve">JPA e </w:t>
-      </w:r>
-      <w:proofErr w:type="spellStart"/>
-      <w:r>
-        <w:rPr>
-          <w:b/>
-          <w:bCs/>
-        </w:rPr>
-        <w:t>Hibernate</w:t>
-      </w:r>
-      <w:proofErr w:type="spellEnd"/>
-      <w:r>
-        <w:rPr>
-          <w:b/>
-          <w:bCs/>
-        </w:rPr>
-        <w:t xml:space="preserve">. </w:t>
-      </w:r>
-      <w:r>
-        <w:t xml:space="preserve">Primeramente, se reciben los datos que llegan del </w:t>
-      </w:r>
-      <w:r>
-        <w:rPr>
-          <w:b/>
-          <w:bCs/>
-        </w:rPr>
-        <w:t xml:space="preserve">@Service </w:t>
-      </w:r>
-      <w:r>
-        <w:t xml:space="preserve">y se envían al repositorio para guardarlos, después de ello, se envía la respuesta obtenida al </w:t>
-      </w:r>
-      <w:r>
-        <w:rPr>
-          <w:b/>
-          <w:bCs/>
-        </w:rPr>
-        <w:t xml:space="preserve">@Service </w:t>
-      </w:r>
-      <w:r>
-        <w:t>nuevamente.</w:t>
-      </w:r>
-    </w:p>
-    <w:p>
-      <w:pPr>
-        <w:pStyle w:val="Ttulo4"/>
-      </w:pPr>
-      <w:r>
-        <w:t>Funcionamiento</w:t>
-      </w:r>
-    </w:p>
-    <w:p>
-      <w:r>
-        <w:t xml:space="preserve">Ahora sí, para la prueba de funcionamiento, ya que todavía no contamos con una interfaz gráfica en el </w:t>
-      </w:r>
-      <w:proofErr w:type="spellStart"/>
-      <w:r>
-        <w:rPr>
-          <w:b/>
-          <w:bCs/>
-        </w:rPr>
-        <w:t>frontend</w:t>
-      </w:r>
-      <w:proofErr w:type="spellEnd"/>
-      <w:r>
-        <w:t xml:space="preserve">, utilizamos la herramienta </w:t>
-      </w:r>
-      <w:proofErr w:type="spellStart"/>
-      <w:r>
-        <w:rPr>
-          <w:b/>
-          <w:bCs/>
-        </w:rPr>
-        <w:t>Postman</w:t>
-      </w:r>
-      <w:proofErr w:type="spellEnd"/>
-      <w:r>
         <w:t xml:space="preserve">, en la cual mandamos la siguiente petición a la </w:t>
       </w:r>
       <w:r>
@@ -4323,7 +4311,6 @@
         <w:rPr>
           <w:noProof/>
         </w:rPr>
-        <w:lastRenderedPageBreak/>
         <w:drawing>
           <wp:inline distT="0" distB="0" distL="0" distR="0" wp14:anchorId="6BCB94B5" wp14:editId="31381EAD">
             <wp:extent cx="5943600" cy="2371090"/>
@@ -4418,6 +4405,7 @@
     </w:p>
     <w:p>
       <w:r>
+        <w:lastRenderedPageBreak/>
         <w:t xml:space="preserve">Y se </w:t>
       </w:r>
       <w:r>
@@ -4469,12 +4457,1021 @@
         </w:drawing>
       </w:r>
     </w:p>
+    <w:p>
+      <w:pPr>
+        <w:pStyle w:val="Ttulo2"/>
+      </w:pPr>
+      <w:r>
+        <w:t>Aplicación del Patrón Factory Method</w:t>
+      </w:r>
+    </w:p>
+    <w:p>
+      <w:pPr>
+        <w:pStyle w:val="Ttulo3"/>
+      </w:pPr>
+      <w:r>
+        <w:t>Como está Colaborando este Patrón al Proyecto</w:t>
+      </w:r>
+    </w:p>
+    <w:p>
+      <w:r>
+        <w:t xml:space="preserve">En nuestro proyecto utilizamos Spring Framework, el cual cuenta con un contenedor de </w:t>
+      </w:r>
+      <w:r>
+        <w:rPr>
+          <w:b/>
+          <w:bCs/>
+        </w:rPr>
+        <w:t>Inversión de Control (</w:t>
+      </w:r>
+      <w:proofErr w:type="spellStart"/>
+      <w:r>
+        <w:rPr>
+          <w:b/>
+          <w:bCs/>
+        </w:rPr>
+        <w:t>IoC</w:t>
+      </w:r>
+      <w:proofErr w:type="spellEnd"/>
+      <w:r>
+        <w:rPr>
+          <w:b/>
+          <w:bCs/>
+        </w:rPr>
+        <w:t xml:space="preserve">) </w:t>
+      </w:r>
+      <w:r>
+        <w:t xml:space="preserve">encargado de crear y gestionar los objetos utilizados por la aplicación. Spring permite definir métodos de creación mediante la anotación </w:t>
+      </w:r>
+      <w:r>
+        <w:rPr>
+          <w:b/>
+          <w:bCs/>
+        </w:rPr>
+        <w:t>@Bean</w:t>
+      </w:r>
+      <w:r>
+        <w:t xml:space="preserve">, los cuales funcionan como un mecanismo de </w:t>
+      </w:r>
+      <w:r>
+        <w:rPr>
+          <w:b/>
+          <w:bCs/>
+        </w:rPr>
+        <w:t>Factory Method</w:t>
+      </w:r>
+      <w:r>
+        <w:t>, ya que encapsulan la creación de una instancia y permiten trabajar con una abstracción sin depender directamente de su implementación.</w:t>
+      </w:r>
+    </w:p>
+    <w:p>
+      <w:r>
+        <w:t xml:space="preserve">En nuestro caso, este patrón se utiliza principalmente en Spring Security para la creación de </w:t>
+      </w:r>
+      <w:proofErr w:type="spellStart"/>
+      <w:r>
+        <w:rPr>
+          <w:b/>
+          <w:bCs/>
+        </w:rPr>
+        <w:t>PasswordEncoder</w:t>
+      </w:r>
+      <w:proofErr w:type="spellEnd"/>
+      <w:r>
+        <w:t xml:space="preserve">, cuya implementación concreta es </w:t>
+      </w:r>
+      <w:proofErr w:type="spellStart"/>
+      <w:r>
+        <w:rPr>
+          <w:b/>
+          <w:bCs/>
+        </w:rPr>
+        <w:t>BCryptPasswordEncoder</w:t>
+      </w:r>
+      <w:proofErr w:type="spellEnd"/>
+      <w:r>
+        <w:t xml:space="preserve">. Esto permite que los componentes que necesitan procesar contraseñas dependan de </w:t>
+      </w:r>
+      <w:proofErr w:type="spellStart"/>
+      <w:r>
+        <w:rPr>
+          <w:b/>
+          <w:bCs/>
+        </w:rPr>
+        <w:t>PasswordEncoder</w:t>
+      </w:r>
+      <w:proofErr w:type="spellEnd"/>
+      <w:r>
+        <w:t xml:space="preserve"> y no directamente de </w:t>
+      </w:r>
+      <w:proofErr w:type="spellStart"/>
+      <w:r>
+        <w:rPr>
+          <w:b/>
+          <w:bCs/>
+        </w:rPr>
+        <w:t>BCrypt</w:t>
+      </w:r>
+      <w:proofErr w:type="spellEnd"/>
+      <w:r>
+        <w:t>, reduciendo el acoplamiento y facilitando un posible cambio de implementación. Además, al combinarse con la inyección de dependencias de Spring, la creación y gestión de estos componentes queda centralizada y facilita el mantenimiento del proyecto.</w:t>
+      </w:r>
+    </w:p>
+    <w:p>
+      <w:pPr>
+        <w:pStyle w:val="Ttulo3"/>
+      </w:pPr>
+      <w:r>
+        <w:t>Evidencias de Uso</w:t>
+      </w:r>
+    </w:p>
+    <w:p>
+      <w:pPr>
+        <w:rPr>
+          <w:b/>
+          <w:bCs/>
+        </w:rPr>
+      </w:pPr>
+      <w:r>
+        <w:rPr>
+          <w:b/>
+          <w:bCs/>
+        </w:rPr>
+        <w:t>Fabrica</w:t>
+      </w:r>
+    </w:p>
+    <w:p>
+      <w:pPr>
+        <w:jc w:val="center"/>
+        <w:rPr>
+          <w:b/>
+          <w:bCs/>
+        </w:rPr>
+      </w:pPr>
+      <w:r>
+        <w:rPr>
+          <w:b/>
+          <w:bCs/>
+        </w:rPr>
+        <w:drawing>
+          <wp:inline distT="0" distB="0" distL="0" distR="0" wp14:anchorId="3534E270" wp14:editId="48DFBBED">
+            <wp:extent cx="2772162" cy="876422"/>
+            <wp:effectExtent l="0" t="0" r="9525" b="0"/>
+            <wp:docPr id="8" name="Imagen 8"/>
+            <wp:cNvGraphicFramePr>
+              <a:graphicFrameLocks xmlns:a="http://schemas.openxmlformats.org/drawingml/2006/main" noChangeAspect="1"/>
+            </wp:cNvGraphicFramePr>
+            <a:graphic xmlns:a="http://schemas.openxmlformats.org/drawingml/2006/main">
+              <a:graphicData uri="http://schemas.openxmlformats.org/drawingml/2006/picture">
+                <pic:pic xmlns:pic="http://schemas.openxmlformats.org/drawingml/2006/picture">
+                  <pic:nvPicPr>
+                    <pic:cNvPr id="1" name=""/>
+                    <pic:cNvPicPr/>
+                  </pic:nvPicPr>
+                  <pic:blipFill>
+                    <a:blip r:embed="rId14"/>
+                    <a:stretch>
+                      <a:fillRect/>
+                    </a:stretch>
+                  </pic:blipFill>
+                  <pic:spPr>
+                    <a:xfrm>
+                      <a:off x="0" y="0"/>
+                      <a:ext cx="2772162" cy="876422"/>
+                    </a:xfrm>
+                    <a:prstGeom prst="rect">
+                      <a:avLst/>
+                    </a:prstGeom>
+                  </pic:spPr>
+                </pic:pic>
+              </a:graphicData>
+            </a:graphic>
+          </wp:inline>
+        </w:drawing>
+      </w:r>
+    </w:p>
+    <w:p>
+      <w:pPr>
+        <w:jc w:val="left"/>
+        <w:rPr>
+          <w:b/>
+          <w:bCs/>
+        </w:rPr>
+      </w:pPr>
+      <w:r>
+        <w:rPr>
+          <w:b/>
+          <w:bCs/>
+        </w:rPr>
+        <w:lastRenderedPageBreak/>
+        <w:t>Producto</w:t>
+      </w:r>
+    </w:p>
+    <w:p>
+      <w:pPr>
+        <w:jc w:val="center"/>
+        <w:rPr>
+          <w:b/>
+          <w:bCs/>
+        </w:rPr>
+      </w:pPr>
+      <w:r>
+        <w:rPr>
+          <w:b/>
+          <w:bCs/>
+        </w:rPr>
+        <w:drawing>
+          <wp:inline distT="0" distB="0" distL="0" distR="0" wp14:anchorId="5967A4D5" wp14:editId="4D982305">
+            <wp:extent cx="5943600" cy="2326005"/>
+            <wp:effectExtent l="0" t="0" r="0" b="0"/>
+            <wp:docPr id="10" name="Imagen 10"/>
+            <wp:cNvGraphicFramePr>
+              <a:graphicFrameLocks xmlns:a="http://schemas.openxmlformats.org/drawingml/2006/main" noChangeAspect="1"/>
+            </wp:cNvGraphicFramePr>
+            <a:graphic xmlns:a="http://schemas.openxmlformats.org/drawingml/2006/main">
+              <a:graphicData uri="http://schemas.openxmlformats.org/drawingml/2006/picture">
+                <pic:pic xmlns:pic="http://schemas.openxmlformats.org/drawingml/2006/picture">
+                  <pic:nvPicPr>
+                    <pic:cNvPr id="1" name=""/>
+                    <pic:cNvPicPr/>
+                  </pic:nvPicPr>
+                  <pic:blipFill>
+                    <a:blip r:embed="rId15"/>
+                    <a:stretch>
+                      <a:fillRect/>
+                    </a:stretch>
+                  </pic:blipFill>
+                  <pic:spPr>
+                    <a:xfrm>
+                      <a:off x="0" y="0"/>
+                      <a:ext cx="5943600" cy="2326005"/>
+                    </a:xfrm>
+                    <a:prstGeom prst="rect">
+                      <a:avLst/>
+                    </a:prstGeom>
+                  </pic:spPr>
+                </pic:pic>
+              </a:graphicData>
+            </a:graphic>
+          </wp:inline>
+        </w:drawing>
+      </w:r>
+    </w:p>
+    <w:p>
+      <w:pPr>
+        <w:jc w:val="left"/>
+        <w:rPr>
+          <w:b/>
+          <w:bCs/>
+        </w:rPr>
+      </w:pPr>
+      <w:r>
+        <w:rPr>
+          <w:b/>
+          <w:bCs/>
+        </w:rPr>
+        <w:t>Producto Concreto</w:t>
+      </w:r>
+    </w:p>
+    <w:p>
+      <w:pPr>
+        <w:jc w:val="left"/>
+        <w:rPr>
+          <w:b/>
+          <w:bCs/>
+        </w:rPr>
+      </w:pPr>
+      <w:r>
+        <w:rPr>
+          <w:b/>
+          <w:bCs/>
+        </w:rPr>
+        <w:drawing>
+          <wp:inline distT="0" distB="0" distL="0" distR="0" wp14:anchorId="2CE39E17" wp14:editId="11D974B8">
+            <wp:extent cx="5943600" cy="4246880"/>
+            <wp:effectExtent l="0" t="0" r="0" b="1270"/>
+            <wp:docPr id="11" name="Imagen 11"/>
+            <wp:cNvGraphicFramePr>
+              <a:graphicFrameLocks xmlns:a="http://schemas.openxmlformats.org/drawingml/2006/main" noChangeAspect="1"/>
+            </wp:cNvGraphicFramePr>
+            <a:graphic xmlns:a="http://schemas.openxmlformats.org/drawingml/2006/main">
+              <a:graphicData uri="http://schemas.openxmlformats.org/drawingml/2006/picture">
+                <pic:pic xmlns:pic="http://schemas.openxmlformats.org/drawingml/2006/picture">
+                  <pic:nvPicPr>
+                    <pic:cNvPr id="1" name=""/>
+                    <pic:cNvPicPr/>
+                  </pic:nvPicPr>
+                  <pic:blipFill>
+                    <a:blip r:embed="rId16"/>
+                    <a:stretch>
+                      <a:fillRect/>
+                    </a:stretch>
+                  </pic:blipFill>
+                  <pic:spPr>
+                    <a:xfrm>
+                      <a:off x="0" y="0"/>
+                      <a:ext cx="5943600" cy="4246880"/>
+                    </a:xfrm>
+                    <a:prstGeom prst="rect">
+                      <a:avLst/>
+                    </a:prstGeom>
+                  </pic:spPr>
+                </pic:pic>
+              </a:graphicData>
+            </a:graphic>
+          </wp:inline>
+        </w:drawing>
+      </w:r>
+    </w:p>
+    <w:p>
+      <w:pPr>
+        <w:jc w:val="left"/>
+        <w:rPr>
+          <w:b/>
+          <w:bCs/>
+        </w:rPr>
+      </w:pPr>
+      <w:r>
+        <w:rPr>
+          <w:b/>
+          <w:bCs/>
+        </w:rPr>
+        <w:lastRenderedPageBreak/>
+        <w:drawing>
+          <wp:inline distT="0" distB="0" distL="0" distR="0" wp14:anchorId="2FF49B68" wp14:editId="45726220">
+            <wp:extent cx="5943600" cy="1198245"/>
+            <wp:effectExtent l="0" t="0" r="0" b="1905"/>
+            <wp:docPr id="12" name="Imagen 12"/>
+            <wp:cNvGraphicFramePr>
+              <a:graphicFrameLocks xmlns:a="http://schemas.openxmlformats.org/drawingml/2006/main" noChangeAspect="1"/>
+            </wp:cNvGraphicFramePr>
+            <a:graphic xmlns:a="http://schemas.openxmlformats.org/drawingml/2006/main">
+              <a:graphicData uri="http://schemas.openxmlformats.org/drawingml/2006/picture">
+                <pic:pic xmlns:pic="http://schemas.openxmlformats.org/drawingml/2006/picture">
+                  <pic:nvPicPr>
+                    <pic:cNvPr id="1" name=""/>
+                    <pic:cNvPicPr/>
+                  </pic:nvPicPr>
+                  <pic:blipFill>
+                    <a:blip r:embed="rId17"/>
+                    <a:stretch>
+                      <a:fillRect/>
+                    </a:stretch>
+                  </pic:blipFill>
+                  <pic:spPr>
+                    <a:xfrm>
+                      <a:off x="0" y="0"/>
+                      <a:ext cx="5943600" cy="1198245"/>
+                    </a:xfrm>
+                    <a:prstGeom prst="rect">
+                      <a:avLst/>
+                    </a:prstGeom>
+                  </pic:spPr>
+                </pic:pic>
+              </a:graphicData>
+            </a:graphic>
+          </wp:inline>
+        </w:drawing>
+      </w:r>
+    </w:p>
+    <w:p>
+      <w:pPr>
+        <w:jc w:val="left"/>
+        <w:rPr>
+          <w:b/>
+          <w:bCs/>
+          <w:lang w:val="en-US"/>
+        </w:rPr>
+      </w:pPr>
+      <w:r>
+        <w:rPr>
+          <w:b/>
+          <w:bCs/>
+        </w:rPr>
+        <w:t>Consumidor</w:t>
+      </w:r>
+    </w:p>
+    <w:p>
+      <w:pPr>
+        <w:jc w:val="left"/>
+        <w:rPr>
+          <w:b/>
+          <w:bCs/>
+        </w:rPr>
+      </w:pPr>
+      <w:r>
+        <w:rPr>
+          <w:b/>
+          <w:bCs/>
+        </w:rPr>
+        <w:drawing>
+          <wp:inline distT="0" distB="0" distL="0" distR="0" wp14:anchorId="1769BF1D" wp14:editId="649C17E9">
+            <wp:extent cx="5943600" cy="1065530"/>
+            <wp:effectExtent l="0" t="0" r="0" b="1270"/>
+            <wp:docPr id="13" name="Imagen 13"/>
+            <wp:cNvGraphicFramePr>
+              <a:graphicFrameLocks xmlns:a="http://schemas.openxmlformats.org/drawingml/2006/main" noChangeAspect="1"/>
+            </wp:cNvGraphicFramePr>
+            <a:graphic xmlns:a="http://schemas.openxmlformats.org/drawingml/2006/main">
+              <a:graphicData uri="http://schemas.openxmlformats.org/drawingml/2006/picture">
+                <pic:pic xmlns:pic="http://schemas.openxmlformats.org/drawingml/2006/picture">
+                  <pic:nvPicPr>
+                    <pic:cNvPr id="1" name=""/>
+                    <pic:cNvPicPr/>
+                  </pic:nvPicPr>
+                  <pic:blipFill>
+                    <a:blip r:embed="rId18"/>
+                    <a:stretch>
+                      <a:fillRect/>
+                    </a:stretch>
+                  </pic:blipFill>
+                  <pic:spPr>
+                    <a:xfrm>
+                      <a:off x="0" y="0"/>
+                      <a:ext cx="5943600" cy="1065530"/>
+                    </a:xfrm>
+                    <a:prstGeom prst="rect">
+                      <a:avLst/>
+                    </a:prstGeom>
+                  </pic:spPr>
+                </pic:pic>
+              </a:graphicData>
+            </a:graphic>
+          </wp:inline>
+        </w:drawing>
+      </w:r>
+    </w:p>
+    <w:p>
+      <w:pPr>
+        <w:pStyle w:val="Ttulo3"/>
+      </w:pPr>
+      <w:r>
+        <w:t>Explicación y Prueba de que Funciona</w:t>
+      </w:r>
+    </w:p>
+    <w:p>
+      <w:pPr>
+        <w:pStyle w:val="Ttulo4"/>
+      </w:pPr>
+      <w:proofErr w:type="spellStart"/>
+      <w:r>
+        <w:t>PasswordEncoder</w:t>
+      </w:r>
+      <w:proofErr w:type="spellEnd"/>
+      <w:r>
+        <w:t xml:space="preserve"> </w:t>
+      </w:r>
+      <w:r>
+        <w:rPr>
+          <w:lang w:val="en-US"/>
+        </w:rPr>
+        <w:t>(</w:t>
+      </w:r>
+      <w:r>
+        <w:t>Producto</w:t>
+      </w:r>
+      <w:r>
+        <w:t>)</w:t>
+      </w:r>
+    </w:p>
+    <w:p>
+      <w:r>
+        <w:t xml:space="preserve">Este componente representa el </w:t>
+      </w:r>
+      <w:r>
+        <w:rPr>
+          <w:b/>
+          <w:bCs/>
+        </w:rPr>
+        <w:t>producto</w:t>
+      </w:r>
+      <w:r>
+        <w:t xml:space="preserve"> dentro del patrón </w:t>
+      </w:r>
+      <w:r>
+        <w:rPr>
+          <w:b/>
+          <w:bCs/>
+        </w:rPr>
+        <w:t>Factory Method</w:t>
+      </w:r>
+      <w:r>
+        <w:t xml:space="preserve">. </w:t>
+      </w:r>
+      <w:proofErr w:type="spellStart"/>
+      <w:r>
+        <w:rPr>
+          <w:b/>
+          <w:bCs/>
+        </w:rPr>
+        <w:t>PasswordEncoder</w:t>
+      </w:r>
+      <w:proofErr w:type="spellEnd"/>
+      <w:r>
+        <w:t xml:space="preserve"> es una abstracción proporcionada por Spring Security que define las operaciones necesarias para trabajar con las contraseñas. Al utilizar esta abstracción, el resto del sistema no necesita conocer qué algoritmo concreto se está utilizando para realizar el cifrado.</w:t>
+      </w:r>
+    </w:p>
+    <w:p>
+      <w:pPr>
+        <w:pStyle w:val="Ttulo4"/>
+      </w:pPr>
+      <w:proofErr w:type="spellStart"/>
+      <w:r>
+        <w:t>BCryptPasswordEncoder</w:t>
+      </w:r>
+      <w:proofErr w:type="spellEnd"/>
+      <w:r>
+        <w:t xml:space="preserve"> </w:t>
+      </w:r>
+      <w:r>
+        <w:t>(</w:t>
+      </w:r>
+      <w:r>
+        <w:t>Producto Concreto</w:t>
+      </w:r>
+      <w:r>
+        <w:t>)</w:t>
+      </w:r>
+    </w:p>
+    <w:p>
+      <w:r>
+        <w:t xml:space="preserve">Esta clase representa el </w:t>
+      </w:r>
+      <w:r>
+        <w:rPr>
+          <w:b/>
+          <w:bCs/>
+        </w:rPr>
+        <w:t>producto concreto</w:t>
+      </w:r>
+      <w:r>
+        <w:t xml:space="preserve">, ya que es una implementación específica de </w:t>
+      </w:r>
+      <w:proofErr w:type="spellStart"/>
+      <w:r>
+        <w:rPr>
+          <w:b/>
+          <w:bCs/>
+        </w:rPr>
+        <w:t>PasswordEncoder</w:t>
+      </w:r>
+      <w:proofErr w:type="spellEnd"/>
+      <w:r>
+        <w:t xml:space="preserve">. En nuestro proyecto utilizamos </w:t>
+      </w:r>
+      <w:proofErr w:type="spellStart"/>
+      <w:r>
+        <w:rPr>
+          <w:b/>
+          <w:bCs/>
+        </w:rPr>
+        <w:t>BCrypt</w:t>
+      </w:r>
+      <w:proofErr w:type="spellEnd"/>
+      <w:r>
+        <w:t xml:space="preserve"> para realizar el procesamiento seguro de las contraseñas, pero gracias a que trabajamos con la abstracción </w:t>
+      </w:r>
+      <w:proofErr w:type="spellStart"/>
+      <w:r>
+        <w:rPr>
+          <w:b/>
+          <w:bCs/>
+        </w:rPr>
+        <w:t>PasswordEncoder</w:t>
+      </w:r>
+      <w:proofErr w:type="spellEnd"/>
+      <w:r>
+        <w:t>, esta implementación podría ser reemplazada por otra sin modificar los componentes que la utilizan.</w:t>
+      </w:r>
+    </w:p>
+    <w:p>
+      <w:pPr>
+        <w:pStyle w:val="Ttulo4"/>
+      </w:pPr>
+      <w:proofErr w:type="spellStart"/>
+      <w:r>
+        <w:t>SecurityConfig</w:t>
+      </w:r>
+      <w:proofErr w:type="spellEnd"/>
+      <w:r>
+        <w:t xml:space="preserve"> </w:t>
+      </w:r>
+      <w:r>
+        <w:t>(</w:t>
+      </w:r>
+      <w:r>
+        <w:t>Fábrica</w:t>
+      </w:r>
+      <w:r>
+        <w:t>)</w:t>
+      </w:r>
+    </w:p>
+    <w:p>
+      <w:r>
+        <w:t xml:space="preserve">En esta clase se encuentra la </w:t>
+      </w:r>
+      <w:r>
+        <w:rPr>
+          <w:b/>
+          <w:bCs/>
+        </w:rPr>
+        <w:t>fábrica del patrón</w:t>
+      </w:r>
+      <w:r>
+        <w:t xml:space="preserve">, ya que mediante el contenedor de Spring se define el método encargado de crear el </w:t>
+      </w:r>
+      <w:proofErr w:type="spellStart"/>
+      <w:r>
+        <w:rPr>
+          <w:b/>
+          <w:bCs/>
+        </w:rPr>
+        <w:t>PasswordEncoder</w:t>
+      </w:r>
+      <w:proofErr w:type="spellEnd"/>
+      <w:r>
+        <w:t xml:space="preserve">. Spring toma el objeto creado mediante este método y lo registra como un </w:t>
+      </w:r>
+      <w:proofErr w:type="spellStart"/>
+      <w:r>
+        <w:rPr>
+          <w:b/>
+          <w:bCs/>
+        </w:rPr>
+        <w:t>Bean</w:t>
+      </w:r>
+      <w:proofErr w:type="spellEnd"/>
+      <w:r>
+        <w:t>, permitiendo posteriormente que sea utilizado mediante inyección de dependencias en los componentes que lo necesiten.</w:t>
+      </w:r>
+    </w:p>
+    <w:p>
+      <w:pPr>
+        <w:pStyle w:val="Ttulo4"/>
+      </w:pPr>
+      <w:proofErr w:type="spellStart"/>
+      <w:r>
+        <w:lastRenderedPageBreak/>
+        <w:t>AuthenticationManager</w:t>
+      </w:r>
+      <w:proofErr w:type="spellEnd"/>
+      <w:r>
+        <w:t xml:space="preserve"> </w:t>
+      </w:r>
+      <w:r>
+        <w:t>(</w:t>
+      </w:r>
+      <w:r>
+        <w:t>Consumidor</w:t>
+      </w:r>
+      <w:r>
+        <w:t>)</w:t>
+      </w:r>
+    </w:p>
+    <w:p>
+      <w:r>
+        <w:t xml:space="preserve">Este componente representa el </w:t>
+      </w:r>
+      <w:r>
+        <w:rPr>
+          <w:b/>
+          <w:bCs/>
+        </w:rPr>
+        <w:t>consumidor</w:t>
+      </w:r>
+      <w:r>
+        <w:t xml:space="preserve"> del </w:t>
+      </w:r>
+      <w:r>
+        <w:rPr>
+          <w:b/>
+          <w:bCs/>
+        </w:rPr>
+        <w:t>producto</w:t>
+      </w:r>
+      <w:r>
+        <w:t xml:space="preserve">, ya que necesita un </w:t>
+      </w:r>
+      <w:proofErr w:type="spellStart"/>
+      <w:r>
+        <w:rPr>
+          <w:b/>
+          <w:bCs/>
+        </w:rPr>
+        <w:t>PasswordEncoder</w:t>
+      </w:r>
+      <w:proofErr w:type="spellEnd"/>
+      <w:r>
+        <w:t xml:space="preserve"> para realizar el proceso de autenticación. Lo importante es que </w:t>
+      </w:r>
+      <w:proofErr w:type="spellStart"/>
+      <w:r>
+        <w:rPr>
+          <w:b/>
+          <w:bCs/>
+        </w:rPr>
+        <w:t>AuthenticationManager</w:t>
+      </w:r>
+      <w:proofErr w:type="spellEnd"/>
+      <w:r>
+        <w:t xml:space="preserve"> trabaja con la abstracción </w:t>
+      </w:r>
+      <w:proofErr w:type="spellStart"/>
+      <w:r>
+        <w:rPr>
+          <w:b/>
+          <w:bCs/>
+        </w:rPr>
+        <w:t>PasswordEncoder</w:t>
+      </w:r>
+      <w:proofErr w:type="spellEnd"/>
+      <w:r>
+        <w:t xml:space="preserve"> y no necesita conocer directamente a </w:t>
+      </w:r>
+      <w:proofErr w:type="spellStart"/>
+      <w:r>
+        <w:rPr>
+          <w:b/>
+          <w:bCs/>
+        </w:rPr>
+        <w:t>BCryptPasswordEncoder</w:t>
+      </w:r>
+      <w:proofErr w:type="spellEnd"/>
+      <w:r>
+        <w:t xml:space="preserve">, </w:t>
+      </w:r>
+      <w:r>
+        <w:t>demostrando,</w:t>
+      </w:r>
+      <w:r>
+        <w:t xml:space="preserve"> así </w:t>
+      </w:r>
+      <w:r>
+        <w:t>como</w:t>
+      </w:r>
+      <w:r>
+        <w:t xml:space="preserve"> el Factory Method ayuda a reducir el acoplamiento entre ambos componentes.</w:t>
+      </w:r>
+    </w:p>
+    <w:p>
+      <w:pPr>
+        <w:pStyle w:val="Ttulo4"/>
+      </w:pPr>
+      <w:r>
+        <w:t>Funcionamiento</w:t>
+      </w:r>
+    </w:p>
+    <w:p>
+      <w:r>
+        <w:t xml:space="preserve">Ahora sí, para la prueba de funcionamiento, ya que todavía no contamos con una interfaz gráfica en el </w:t>
+      </w:r>
+      <w:proofErr w:type="spellStart"/>
+      <w:r>
+        <w:rPr>
+          <w:b/>
+          <w:bCs/>
+        </w:rPr>
+        <w:t>frontend</w:t>
+      </w:r>
+      <w:proofErr w:type="spellEnd"/>
+      <w:r>
+        <w:t xml:space="preserve">, utilizamos la herramienta </w:t>
+      </w:r>
+      <w:proofErr w:type="spellStart"/>
+      <w:r>
+        <w:rPr>
+          <w:b/>
+          <w:bCs/>
+        </w:rPr>
+        <w:t>Postman</w:t>
+      </w:r>
+      <w:proofErr w:type="spellEnd"/>
+      <w:r>
+        <w:t xml:space="preserve">, en la cual mandamos la siguiente petición a la </w:t>
+      </w:r>
+      <w:r>
+        <w:rPr>
+          <w:b/>
+          <w:bCs/>
+        </w:rPr>
+        <w:t>API.</w:t>
+      </w:r>
+    </w:p>
+    <w:p>
+      <w:r>
+        <w:rPr>
+          <w:b/>
+          <w:bCs/>
+        </w:rPr>
+        <w:t xml:space="preserve">NOTA: </w:t>
+      </w:r>
+      <w:r>
+        <w:t xml:space="preserve">Cabe resaltar que para esta prueba de autenticación del usuario </w:t>
+      </w:r>
+      <w:r>
+        <w:t>ya había un usuario creado en base de datos y trabajamos con</w:t>
+      </w:r>
+      <w:r>
+        <w:rPr>
+          <w:b/>
+          <w:bCs/>
+        </w:rPr>
+        <w:t xml:space="preserve"> </w:t>
+      </w:r>
+      <w:proofErr w:type="spellStart"/>
+      <w:r>
+        <w:rPr>
+          <w:b/>
+          <w:bCs/>
+        </w:rPr>
+        <w:t>Json</w:t>
+      </w:r>
+      <w:proofErr w:type="spellEnd"/>
+      <w:r>
+        <w:rPr>
+          <w:b/>
+          <w:bCs/>
+        </w:rPr>
+        <w:t xml:space="preserve"> Web Tokens </w:t>
+      </w:r>
+      <w:r>
+        <w:t>además de Spring Security.</w:t>
+      </w:r>
+    </w:p>
+    <w:p>
+      <w:r>
+        <w:t>El usuario creado en la base de datos es el siguiente:</w:t>
+      </w:r>
+    </w:p>
+    <w:p>
+      <w:r>
+        <w:drawing>
+          <wp:inline distT="0" distB="0" distL="0" distR="0" wp14:anchorId="280B21E2" wp14:editId="2AE3C75A">
+            <wp:extent cx="5943600" cy="338455"/>
+            <wp:effectExtent l="0" t="0" r="0" b="4445"/>
+            <wp:docPr id="15" name="Imagen 15"/>
+            <wp:cNvGraphicFramePr>
+              <a:graphicFrameLocks xmlns:a="http://schemas.openxmlformats.org/drawingml/2006/main" noChangeAspect="1"/>
+            </wp:cNvGraphicFramePr>
+            <a:graphic xmlns:a="http://schemas.openxmlformats.org/drawingml/2006/main">
+              <a:graphicData uri="http://schemas.openxmlformats.org/drawingml/2006/picture">
+                <pic:pic xmlns:pic="http://schemas.openxmlformats.org/drawingml/2006/picture">
+                  <pic:nvPicPr>
+                    <pic:cNvPr id="1" name=""/>
+                    <pic:cNvPicPr/>
+                  </pic:nvPicPr>
+                  <pic:blipFill>
+                    <a:blip r:embed="rId19"/>
+                    <a:stretch>
+                      <a:fillRect/>
+                    </a:stretch>
+                  </pic:blipFill>
+                  <pic:spPr>
+                    <a:xfrm>
+                      <a:off x="0" y="0"/>
+                      <a:ext cx="5943600" cy="338455"/>
+                    </a:xfrm>
+                    <a:prstGeom prst="rect">
+                      <a:avLst/>
+                    </a:prstGeom>
+                  </pic:spPr>
+                </pic:pic>
+              </a:graphicData>
+            </a:graphic>
+          </wp:inline>
+        </w:drawing>
+      </w:r>
+    </w:p>
+    <w:p>
+      <w:r>
+        <w:t xml:space="preserve">Como podemos ver, la contraseña del usuario ya se encuentra encriptada desde su creación, así que, para poder autenticar al usuario en el sistema, el </w:t>
+      </w:r>
+      <w:proofErr w:type="spellStart"/>
+      <w:r>
+        <w:rPr>
+          <w:b/>
+          <w:bCs/>
+        </w:rPr>
+        <w:t>AuthenticationManager</w:t>
+      </w:r>
+      <w:proofErr w:type="spellEnd"/>
+      <w:r>
+        <w:rPr>
+          <w:b/>
+          <w:bCs/>
+        </w:rPr>
+        <w:t xml:space="preserve"> </w:t>
+      </w:r>
+      <w:r>
+        <w:t xml:space="preserve">de Spring Security deberá utilizar a </w:t>
+      </w:r>
+      <w:proofErr w:type="spellStart"/>
+      <w:r>
+        <w:rPr>
+          <w:b/>
+          <w:bCs/>
+        </w:rPr>
+        <w:t>BCryptPasswordEncoder</w:t>
+      </w:r>
+      <w:proofErr w:type="spellEnd"/>
+      <w:r>
+        <w:rPr>
+          <w:b/>
+          <w:bCs/>
+        </w:rPr>
+        <w:t xml:space="preserve"> </w:t>
+      </w:r>
+      <w:r>
+        <w:t>para ver si la contraseña ingresada por el usuario es igual a la de la base de datos. El resultado fue el siguiente:</w:t>
+      </w:r>
+    </w:p>
+    <w:p>
+      <w:r>
+        <w:drawing>
+          <wp:inline distT="0" distB="0" distL="0" distR="0" wp14:anchorId="53F81A13" wp14:editId="3D487E8D">
+            <wp:extent cx="6170320" cy="2886075"/>
+            <wp:effectExtent l="0" t="0" r="1905" b="0"/>
+            <wp:docPr id="14" name="Imagen 14"/>
+            <wp:cNvGraphicFramePr>
+              <a:graphicFrameLocks xmlns:a="http://schemas.openxmlformats.org/drawingml/2006/main" noChangeAspect="1"/>
+            </wp:cNvGraphicFramePr>
+            <a:graphic xmlns:a="http://schemas.openxmlformats.org/drawingml/2006/main">
+              <a:graphicData uri="http://schemas.openxmlformats.org/drawingml/2006/picture">
+                <pic:pic xmlns:pic="http://schemas.openxmlformats.org/drawingml/2006/picture">
+                  <pic:nvPicPr>
+                    <pic:cNvPr id="1" name=""/>
+                    <pic:cNvPicPr/>
+                  </pic:nvPicPr>
+                  <pic:blipFill>
+                    <a:blip r:embed="rId20"/>
+                    <a:stretch>
+                      <a:fillRect/>
+                    </a:stretch>
+                  </pic:blipFill>
+                  <pic:spPr>
+                    <a:xfrm>
+                      <a:off x="0" y="0"/>
+                      <a:ext cx="6172583" cy="2887133"/>
+                    </a:xfrm>
+                    <a:prstGeom prst="rect">
+                      <a:avLst/>
+                    </a:prstGeom>
+                  </pic:spPr>
+                </pic:pic>
+              </a:graphicData>
+            </a:graphic>
+          </wp:inline>
+        </w:drawing>
+      </w:r>
+    </w:p>
+    <w:p>
+      <w:r>
+        <w:lastRenderedPageBreak/>
+        <w:t xml:space="preserve">Exitosamente la </w:t>
+      </w:r>
+      <w:r>
+        <w:rPr>
+          <w:b/>
+          <w:bCs/>
+        </w:rPr>
+        <w:t>API REST</w:t>
+      </w:r>
+      <w:r>
+        <w:t xml:space="preserve"> responde con código </w:t>
+      </w:r>
+      <w:r>
+        <w:rPr>
+          <w:b/>
+          <w:bCs/>
+        </w:rPr>
+        <w:t>http 200</w:t>
+      </w:r>
+      <w:r>
+        <w:t xml:space="preserve"> y con el cuerpo de la respuesta indicando el token JWT generado después de la autenticación. Por lo que indica que el proceso de encriptar la contraseña y compararla con la de la base de datos fue un </w:t>
+      </w:r>
+      <w:r>
+        <w:rPr>
+          <w:b/>
+          <w:bCs/>
+        </w:rPr>
+        <w:t>éxito.</w:t>
+      </w:r>
+    </w:p>
     <w:p/>
     <w:p/>
+    <w:p>
+      <w:pPr>
+        <w:jc w:val="left"/>
+        <w:rPr>
+          <w:b/>
+          <w:bCs/>
+        </w:rPr>
+      </w:pPr>
+    </w:p>
     <w:p/>
     <w:p/>
     <w:sectPr>
-      <w:headerReference w:type="default" r:id="rId14"/>
+      <w:headerReference w:type="default" r:id="rId21"/>
       <w:pgSz w:w="12240" w:h="15840"/>
       <w:pgMar w:top="1440" w:right="1440" w:bottom="1440" w:left="1440" w:header="709" w:footer="709" w:gutter="0"/>
       <w:cols w:space="720"/>

</xml_diff>